<commit_message>
Refresh resume site content, assets, and theme support.
Update experience and location, remove unused Bootstrap/jQuery vendor files, add light/dark/sepia themes, and link the new resume PDF.

Co-authored-by: Cursor <cursoragent@cursor.com>
</commit_message>
<xml_diff>
--- a/resources/Aaron_Berman Federal Resume v1.docx
+++ b/resources/Aaron_Berman Federal Resume v1.docx
@@ -41,7 +41,7 @@
           <w:sz w:val="23"/>
           <w:szCs w:val="23"/>
         </w:rPr>
-        <w:t>Norfolk, VA 23502</w:t>
+        <w:t>Chesapeake, VA</w:t>
       </w:r>
     </w:p>
     <w:p>
@@ -155,7 +155,7 @@
           <w:sz w:val="23"/>
           <w:szCs w:val="23"/>
         </w:rPr>
-        <w:t xml:space="preserve">Computer Scientist | </w:t>
+        <w:t>Streaming Support Engineer | Computer Scientist | Systems Administrator | Security Specialist</w:t>
       </w:r>
       <w:r>
         <w:rPr>
@@ -164,7 +164,6 @@
           <w:sz w:val="23"/>
           <w:szCs w:val="23"/>
         </w:rPr>
-        <w:t xml:space="preserve">Systems Administrator | </w:t>
       </w:r>
       <w:r>
         <w:rPr>
@@ -173,7 +172,6 @@
           <w:sz w:val="23"/>
           <w:szCs w:val="23"/>
         </w:rPr>
-        <w:t>Security Specialist | Security Consultant</w:t>
       </w:r>
       <w:r>
         <w:rPr>
@@ -182,7 +180,6 @@
           <w:sz w:val="23"/>
           <w:szCs w:val="23"/>
         </w:rPr>
-        <w:t xml:space="preserve"> | </w:t>
       </w:r>
       <w:r>
         <w:rPr>
@@ -191,7 +188,6 @@
           <w:sz w:val="23"/>
           <w:szCs w:val="23"/>
         </w:rPr>
-        <w:t>Software Analyst</w:t>
       </w:r>
       <w:r>
         <w:rPr>
@@ -200,7 +196,6 @@
           <w:sz w:val="23"/>
           <w:szCs w:val="23"/>
         </w:rPr>
-        <w:t xml:space="preserve"> </w:t>
       </w:r>
     </w:p>
     <w:p>
@@ -500,7 +495,7 @@
           <w:sz w:val="23"/>
           <w:szCs w:val="23"/>
         </w:rPr>
-        <w:t>Software | Systems Security</w:t>
+        <w:t>Software | Tools: Git, Docker, Docker Compose, MySQL, Apache, Bootstrap, Grafana, Splunk, Observe, Jira, Jira Service Management (JSM), Confluence, Slack, Microsoft Teams, AWS Systems Manager (SSM), Kiro (AI), Office 365, SharePoint, course authoring tools</w:t>
       </w:r>
     </w:p>
     <w:p>
@@ -909,7 +904,7 @@
           <w:sz w:val="23"/>
           <w:szCs w:val="23"/>
         </w:rPr>
-        <w:t xml:space="preserve">Old Dominion University </w:t>
+        <w:t>Old Dominion University Norfolk, VA United States</w:t>
       </w:r>
       <w:r>
         <w:rPr>
@@ -918,7 +913,6 @@
           <w:sz w:val="23"/>
           <w:szCs w:val="23"/>
         </w:rPr>
-        <w:t>Norfolk, VA United States</w:t>
       </w:r>
     </w:p>
     <w:p>
@@ -1187,7 +1181,7 @@
           <w:sz w:val="23"/>
           <w:szCs w:val="23"/>
         </w:rPr>
-        <w:t xml:space="preserve">Tidewater Community College </w:t>
+        <w:t>Tidewater Community College Norfolk, VA United States</w:t>
       </w:r>
       <w:r>
         <w:rPr>
@@ -1196,7 +1190,6 @@
           <w:sz w:val="23"/>
           <w:szCs w:val="23"/>
         </w:rPr>
-        <w:t>Norfolk, VA United States</w:t>
       </w:r>
     </w:p>
     <w:p>
@@ -1804,7 +1797,7 @@
           <w:sz w:val="23"/>
           <w:szCs w:val="23"/>
         </w:rPr>
-        <w:t xml:space="preserve">Programming: </w:t>
+        <w:t>Programming: C++, Python, Java, HTML, CSS, JavaScript, TypeScript, PHP, Bash, Regex</w:t>
       </w:r>
       <w:r>
         <w:rPr>
@@ -1812,7 +1805,6 @@
           <w:sz w:val="23"/>
           <w:szCs w:val="23"/>
         </w:rPr>
-        <w:t>C++, Python, Jav</w:t>
       </w:r>
       <w:r>
         <w:rPr>
@@ -1820,7 +1812,6 @@
           <w:sz w:val="23"/>
           <w:szCs w:val="23"/>
         </w:rPr>
-        <w:t>a</w:t>
       </w:r>
       <w:r>
         <w:rPr>
@@ -1828,7 +1819,6 @@
           <w:sz w:val="23"/>
           <w:szCs w:val="23"/>
         </w:rPr>
-        <w:t>, HTML, CSS</w:t>
       </w:r>
       <w:r>
         <w:rPr>
@@ -1836,7 +1826,6 @@
           <w:sz w:val="23"/>
           <w:szCs w:val="23"/>
         </w:rPr>
-        <w:t>, PHP</w:t>
       </w:r>
     </w:p>
     <w:p>
@@ -1856,7 +1845,7 @@
           <w:sz w:val="23"/>
           <w:szCs w:val="23"/>
         </w:rPr>
-        <w:t>Operating</w:t>
+        <w:t>Operating Systems: Linux, Unix, macOS, Windows 10/11</w:t>
       </w:r>
       <w:r>
         <w:rPr>
@@ -1864,7 +1853,6 @@
           <w:sz w:val="23"/>
           <w:szCs w:val="23"/>
         </w:rPr>
-        <w:t xml:space="preserve"> </w:t>
       </w:r>
       <w:r>
         <w:rPr>
@@ -1873,7 +1861,6 @@
           <w:sz w:val="23"/>
           <w:szCs w:val="23"/>
         </w:rPr>
-        <w:t>Systems</w:t>
       </w:r>
       <w:r>
         <w:rPr>
@@ -1881,7 +1868,6 @@
           <w:sz w:val="23"/>
           <w:szCs w:val="23"/>
         </w:rPr>
-        <w:t>:</w:t>
       </w:r>
       <w:r>
         <w:rPr>
@@ -1889,7 +1875,6 @@
           <w:sz w:val="23"/>
           <w:szCs w:val="23"/>
         </w:rPr>
-        <w:t xml:space="preserve"> </w:t>
       </w:r>
       <w:r>
         <w:rPr>
@@ -1897,7 +1882,6 @@
           <w:sz w:val="23"/>
           <w:szCs w:val="23"/>
         </w:rPr>
-        <w:t>Linux, Mac, Windows Server 2008, Windows XP</w:t>
       </w:r>
       <w:r>
         <w:rPr>
@@ -1905,7 +1889,6 @@
           <w:sz w:val="23"/>
           <w:szCs w:val="23"/>
         </w:rPr>
-        <w:t>, Windows 10, Windows 7</w:t>
       </w:r>
     </w:p>
     <w:p>
@@ -1925,7 +1908,7 @@
           <w:sz w:val="23"/>
           <w:szCs w:val="23"/>
         </w:rPr>
-        <w:t>Software</w:t>
+        <w:t>Software | Tools: Git, Docker, Docker Compose, MySQL, Apache, Bootstrap, Grafana, Splunk, Observe, Jira, Jira Service Management (JSM), Confluence, Slack, Microsoft Teams, AWS Systems Manager (SSM), Kiro (AI), Office 365, SharePoint, course authoring tools</w:t>
       </w:r>
       <w:r>
         <w:rPr>
@@ -1934,7 +1917,6 @@
           <w:sz w:val="23"/>
           <w:szCs w:val="23"/>
         </w:rPr>
-        <w:t xml:space="preserve"> | Database</w:t>
       </w:r>
       <w:r>
         <w:rPr>
@@ -1942,7 +1924,6 @@
           <w:sz w:val="23"/>
           <w:szCs w:val="23"/>
         </w:rPr>
-        <w:t>: Microsoft Office, Google Docs</w:t>
       </w:r>
       <w:r>
         <w:rPr>
@@ -1950,7 +1931,6 @@
           <w:sz w:val="23"/>
           <w:szCs w:val="23"/>
         </w:rPr>
-        <w:t xml:space="preserve">, </w:t>
       </w:r>
       <w:r>
         <w:rPr>
@@ -1958,7 +1938,6 @@
           <w:sz w:val="23"/>
           <w:szCs w:val="23"/>
         </w:rPr>
-        <w:t>Git,</w:t>
       </w:r>
       <w:r>
         <w:rPr>
@@ -1966,7 +1945,6 @@
           <w:sz w:val="23"/>
           <w:szCs w:val="23"/>
         </w:rPr>
-        <w:t xml:space="preserve"> Bash,</w:t>
       </w:r>
       <w:r>
         <w:rPr>
@@ -1974,7 +1952,6 @@
           <w:sz w:val="23"/>
           <w:szCs w:val="23"/>
         </w:rPr>
-        <w:t xml:space="preserve"> MySQL, Docker</w:t>
       </w:r>
       <w:r>
         <w:rPr>
@@ -1982,7 +1959,6 @@
           <w:sz w:val="23"/>
           <w:szCs w:val="23"/>
         </w:rPr>
-        <w:t>,</w:t>
       </w:r>
       <w:r>
         <w:rPr>
@@ -1990,7 +1966,6 @@
           <w:sz w:val="23"/>
           <w:szCs w:val="23"/>
         </w:rPr>
-        <w:t xml:space="preserve"> Docker Compose</w:t>
       </w:r>
       <w:r>
         <w:rPr>
@@ -1998,7 +1973,6 @@
           <w:sz w:val="23"/>
           <w:szCs w:val="23"/>
         </w:rPr>
-        <w:t>, Bootstrap, Apache</w:t>
       </w:r>
     </w:p>
     <w:p>
@@ -2038,2031 +2012,616 @@
       </w:r>
     </w:p>
     <w:p>
-      <w:pPr>
-        <w:jc w:val="center"/>
-        <w:rPr>
-          <w:rFonts w:ascii="Garamond" w:hAnsi="Garamond" w:cs="Big Caslon Medium"/>
-          <w:b/>
-          <w:sz w:val="23"/>
-          <w:szCs w:val="23"/>
-        </w:rPr>
-      </w:pPr>
-    </w:p>
-    <w:p>
-      <w:pPr>
-        <w:rPr>
-          <w:rFonts w:ascii="Garamond" w:eastAsia="Calibri" w:hAnsi="Garamond" w:cs="Big Caslon Medium"/>
-          <w:b/>
-          <w:bCs/>
-          <w:kern w:val="0"/>
-          <w:sz w:val="23"/>
-          <w:szCs w:val="23"/>
-        </w:rPr>
-        <w:sectPr>
-          <w:type w:val="continuous"/>
-          <w:pgSz w:w="12240" w:h="15840"/>
-          <w:pgMar w:top="720" w:right="720" w:bottom="288" w:left="720" w:header="720" w:footer="720" w:gutter="0"/>
-          <w:cols w:space="720"/>
-          <w:titlePg/>
-          <w:docGrid w:linePitch="360"/>
-        </w:sectPr>
-      </w:pPr>
-    </w:p>
-    <w:p>
-      <w:pPr>
-        <w:rPr>
-          <w:rFonts w:ascii="Garamond" w:eastAsia="Calibri" w:hAnsi="Garamond" w:cs="Big Caslon Medium"/>
-          <w:b/>
-          <w:bCs/>
-          <w:kern w:val="0"/>
-          <w:sz w:val="23"/>
-          <w:szCs w:val="23"/>
-        </w:rPr>
-      </w:pPr>
-      <w:r>
-        <w:rPr>
-          <w:rFonts w:ascii="Garamond" w:eastAsia="Calibri" w:hAnsi="Garamond" w:cs="Big Caslon Medium"/>
-          <w:b/>
-          <w:bCs/>
-          <w:kern w:val="0"/>
-          <w:sz w:val="23"/>
-          <w:szCs w:val="23"/>
-        </w:rPr>
-        <w:t xml:space="preserve">TE Connectivity </w:t>
-      </w:r>
-    </w:p>
-    <w:p>
-      <w:pPr>
-        <w:rPr>
-          <w:rFonts w:ascii="Garamond" w:eastAsia="Calibri" w:hAnsi="Garamond" w:cs="Big Caslon Medium"/>
-          <w:kern w:val="0"/>
-          <w:sz w:val="23"/>
-          <w:szCs w:val="23"/>
-        </w:rPr>
-      </w:pPr>
-      <w:r>
-        <w:rPr>
-          <w:rFonts w:ascii="Garamond" w:eastAsia="Calibri" w:hAnsi="Garamond" w:cs="Big Caslon Medium"/>
-          <w:kern w:val="0"/>
-          <w:sz w:val="23"/>
-          <w:szCs w:val="23"/>
-        </w:rPr>
+      <w:pPr/>
+    </w:p>
+    <w:p>
+      <w:pPr/>
+      <w:r>
+        <w:t>Uplynk (formerly Edgio)</w:t>
+      </w:r>
+    </w:p>
+    <w:p>
+      <w:pPr/>
+      <w:r>
+        <w:t>United States</w:t>
+      </w:r>
+    </w:p>
+    <w:p>
+      <w:pPr/>
+      <w:r>
+        <w:t>https://www.uplynk.com/</w:t>
+      </w:r>
+    </w:p>
+    <w:p>
+      <w:pPr/>
+      <w:r>
+        <w:t>Start date: 09/12/2023</w:t>
+      </w:r>
+    </w:p>
+    <w:p>
+      <w:pPr/>
+      <w:r>
+        <w:t>End date: Present</w:t>
+      </w:r>
+    </w:p>
+    <w:p>
+      <w:pPr/>
+      <w:r>
+        <w:t>Hours per week: 40</w:t>
+      </w:r>
+    </w:p>
+    <w:p>
+      <w:pPr/>
+    </w:p>
+    <w:p>
+      <w:pPr/>
+      <w:r>
+        <w:t>Streaming Support Engineer</w:t>
+      </w:r>
+    </w:p>
+    <w:p>
+      <w:pPr/>
+      <w:r>
+        <w:t>Duties, Accomplishments, and Related Skills:</w:t>
+      </w:r>
+    </w:p>
+    <w:p>
+      <w:pPr>
+        <w:pStyle w:val="ListParagraph"/>
+      </w:pPr>
+      <w:r>
+        <w:t>Provide technical support for a cloud-based live and VOD streaming platform, troubleshooting playback, ingest, and delivery issues through to root cause</w:t>
+      </w:r>
+    </w:p>
+    <w:p>
+      <w:pPr>
+        <w:pStyle w:val="ListParagraph"/>
+      </w:pPr>
+      <w:r>
+        <w:t>Led triage and customer communications for 25+ high-priority incidents, partnering with developers to diagnose issues and keep stakeholders informed</w:t>
+      </w:r>
+    </w:p>
+    <w:p/>
+    <w:p>
+      <w:pPr>
+        <w:pStyle w:val="ListParagraph"/>
+      </w:pPr>
+      <w:r>
+        <w:t>Author and proofread Official Incident Reports (OIRs) and Root Cause Analyses (RCAs) for major incidents</w:t>
+      </w:r>
+    </w:p>
+    <w:p>
+      <w:pPr>
+        <w:pStyle w:val="ListParagraph"/>
+      </w:pPr>
+      <w:r>
+        <w:t>Created and presented 10+ Technical Knowledge Shares (TKS) to improve team troubleshooting and operational readiness</w:t>
+      </w:r>
+    </w:p>
+    <w:p>
+      <w:pPr>
+        <w:pStyle w:val="ListParagraph"/>
+      </w:pPr>
+      <w:r>
+        <w:t>Use observability and monitoring tools including Grafana, Splunk, Observe, and Jira Service Management (JSM) to investigate incidents and system health</w:t>
+      </w:r>
+    </w:p>
+    <w:p>
+      <w:pPr>
+        <w:pStyle w:val="ListParagraph"/>
+      </w:pPr>
+      <w:r>
+        <w:t>Automate and accelerate troubleshooting with Python scripting, regular expressions, and AI-assisted analysis in Kiro</w:t>
+      </w:r>
+    </w:p>
+    <w:p>
+      <w:pPr>
+        <w:pStyle w:val="ListParagraph"/>
+      </w:pPr>
+      <w:r>
+        <w:t>Access and administer production systems via macOS/Unix environments and AWS Systems Manager (SSM) remote login</w:t>
+      </w:r>
+    </w:p>
+    <w:p>
+      <w:pPr>
+        <w:pStyle w:val="ListParagraph"/>
+      </w:pPr>
+      <w:r>
+        <w:t>Coordinate incident response and knowledge sharing across Slack, Microsoft Teams, Jira, and Confluence</w:t>
+      </w:r>
+    </w:p>
+    <w:p/>
+    <w:p>
+      <w:pPr/>
+      <w:r>
+        <w:t>Northrop Grumman</w:t>
+      </w:r>
+    </w:p>
+    <w:p>
+      <w:pPr/>
+      <w:r>
+        <w:t>Joint Knowledge Online (JKO)</w:t>
+      </w:r>
+    </w:p>
+    <w:p>
+      <w:pPr/>
+      <w:r>
+        <w:t>United States</w:t>
+      </w:r>
+    </w:p>
+    <w:p>
+      <w:pPr/>
+      <w:r>
+        <w:t>Start date: 10/2022</w:t>
+      </w:r>
+    </w:p>
+    <w:p>
+      <w:pPr/>
+      <w:r>
+        <w:t>End date: 09/12/2023</w:t>
+      </w:r>
+    </w:p>
+    <w:p>
+      <w:pPr/>
+      <w:r>
+        <w:t>Hours per week: 40</w:t>
+      </w:r>
+    </w:p>
+    <w:p>
+      <w:pPr/>
+    </w:p>
+    <w:p>
+      <w:pPr/>
+      <w:r>
+        <w:t>Programmer Analyst</w:t>
+      </w:r>
+    </w:p>
+    <w:p>
+      <w:pPr/>
+      <w:r>
+        <w:t>Duties, Accomplishments, and Related Skills:</w:t>
+      </w:r>
+    </w:p>
+    <w:p>
+      <w:pPr>
+        <w:pStyle w:val="ListParagraph"/>
+      </w:pPr>
+      <w:r>
+        <w:t>Supported Joint Knowledge Online (JKO) learning content as a Programmer Analyst, troubleshooting course defects and delivery issues</w:t>
+      </w:r>
+    </w:p>
+    <w:p>
+      <w:pPr>
+        <w:pStyle w:val="ListParagraph"/>
+      </w:pPr>
+      <w:r>
+        <w:t>Updated and maintained interactive training courses using HTML, CSS, JavaScript, TypeScript, and course authoring software</w:t>
+      </w:r>
+    </w:p>
+    <w:p>
+      <w:pPr>
+        <w:pStyle w:val="ListParagraph"/>
+      </w:pPr>
+      <w:r>
+        <w:t>Reviewed courses for functionality, content quality, and technical readiness prior to release</w:t>
+      </w:r>
+    </w:p>
+    <w:p>
+      <w:pPr>
+        <w:pStyle w:val="ListParagraph"/>
+      </w:pPr>
+      <w:r>
+        <w:t>Diagnosed front-end and course-player issues to improve learner experience on the JKO platform</w:t>
+      </w:r>
+    </w:p>
+    <w:p>
+      <w:pPr/>
+    </w:p>
+    <w:p>
+      <w:pPr/>
+      <w:r>
+        <w:t>TE Connectivity</w:t>
+      </w:r>
+    </w:p>
+    <w:p>
+      <w:pPr/>
+      <w:r>
         <w:t>1000 Lucas Way</w:t>
       </w:r>
     </w:p>
     <w:p>
-      <w:pPr>
-        <w:rPr>
-          <w:rFonts w:ascii="Garamond" w:eastAsia="Calibri" w:hAnsi="Garamond" w:cs="Big Caslon Medium"/>
-          <w:kern w:val="0"/>
-          <w:sz w:val="23"/>
-          <w:szCs w:val="23"/>
-        </w:rPr>
-      </w:pPr>
-      <w:r>
-        <w:rPr>
-          <w:rFonts w:ascii="Garamond" w:eastAsia="Calibri" w:hAnsi="Garamond" w:cs="Big Caslon Medium"/>
-          <w:kern w:val="0"/>
-          <w:sz w:val="23"/>
-          <w:szCs w:val="23"/>
-        </w:rPr>
-        <w:t>Hampton, VA</w:t>
-      </w:r>
-      <w:r>
-        <w:rPr>
-          <w:rFonts w:ascii="Garamond" w:eastAsia="Calibri" w:hAnsi="Garamond" w:cs="Big Caslon Medium"/>
-          <w:b/>
-          <w:bCs/>
-          <w:kern w:val="0"/>
-          <w:sz w:val="23"/>
-          <w:szCs w:val="23"/>
-        </w:rPr>
-        <w:tab/>
-      </w:r>
-      <w:r>
-        <w:rPr>
-          <w:rFonts w:ascii="Garamond" w:eastAsia="Calibri" w:hAnsi="Garamond" w:cs="Big Caslon Medium"/>
-          <w:kern w:val="0"/>
-          <w:sz w:val="23"/>
-          <w:szCs w:val="23"/>
-        </w:rPr>
-        <w:t>23666</w:t>
-      </w:r>
-      <w:r>
-        <w:rPr>
-          <w:rFonts w:ascii="Garamond" w:eastAsia="Calibri" w:hAnsi="Garamond" w:cs="Big Caslon Medium"/>
-          <w:kern w:val="0"/>
-          <w:sz w:val="23"/>
-          <w:szCs w:val="23"/>
-        </w:rPr>
-        <w:t xml:space="preserve"> United States</w:t>
-      </w:r>
-    </w:p>
-    <w:p>
-      <w:pPr>
-        <w:rPr>
-          <w:rFonts w:ascii="Garamond" w:eastAsia="Calibri" w:hAnsi="Garamond" w:cs="Big Caslon Medium"/>
-          <w:b/>
-          <w:bCs/>
-          <w:kern w:val="0"/>
-          <w:sz w:val="23"/>
-          <w:szCs w:val="23"/>
-        </w:rPr>
-      </w:pPr>
-      <w:hyperlink r:id="rId11" w:history="1">
-        <w:r>
-          <w:rPr>
-            <w:rStyle w:val="Hyperlink"/>
-            <w:rFonts w:ascii="Garamond" w:eastAsia="Calibri" w:hAnsi="Garamond" w:cs="Big Caslon Medium"/>
-            <w:b/>
-            <w:bCs/>
-            <w:kern w:val="0"/>
-            <w:sz w:val="23"/>
-            <w:szCs w:val="23"/>
-          </w:rPr>
-          <w:t>https://www.te.com/usa-en/home.html</w:t>
-        </w:r>
-      </w:hyperlink>
-    </w:p>
-    <w:p>
-      <w:pPr>
-        <w:rPr>
-          <w:rFonts w:ascii="Garamond" w:eastAsia="Calibri" w:hAnsi="Garamond" w:cs="Big Caslon Medium"/>
-          <w:kern w:val="0"/>
-          <w:sz w:val="23"/>
-          <w:szCs w:val="23"/>
-        </w:rPr>
-      </w:pPr>
-      <w:r>
-        <w:rPr>
-          <w:rFonts w:ascii="Garamond" w:eastAsia="Calibri" w:hAnsi="Garamond" w:cs="Big Caslon Medium"/>
-          <w:kern w:val="0"/>
-          <w:sz w:val="23"/>
-          <w:szCs w:val="23"/>
-        </w:rPr>
-        <w:t xml:space="preserve">Start date: </w:t>
-      </w:r>
-      <w:r>
-        <w:rPr>
-          <w:rFonts w:ascii="Garamond" w:eastAsia="Calibri" w:hAnsi="Garamond" w:cs="Big Caslon Medium"/>
-          <w:kern w:val="0"/>
-          <w:sz w:val="23"/>
-          <w:szCs w:val="23"/>
-        </w:rPr>
-        <w:t>08/</w:t>
-      </w:r>
-      <w:r>
-        <w:rPr>
-          <w:rFonts w:ascii="Garamond" w:eastAsia="Calibri" w:hAnsi="Garamond" w:cs="Big Caslon Medium"/>
-          <w:kern w:val="0"/>
-          <w:sz w:val="23"/>
-          <w:szCs w:val="23"/>
-        </w:rPr>
-        <w:t xml:space="preserve">2006 </w:t>
-      </w:r>
-    </w:p>
-    <w:p>
-      <w:pPr>
-        <w:rPr>
-          <w:rFonts w:ascii="Garamond" w:eastAsia="Calibri" w:hAnsi="Garamond" w:cs="Big Caslon Medium"/>
-          <w:kern w:val="0"/>
-          <w:sz w:val="23"/>
-          <w:szCs w:val="23"/>
-        </w:rPr>
-      </w:pPr>
-      <w:r>
-        <w:rPr>
-          <w:rFonts w:ascii="Garamond" w:eastAsia="Calibri" w:hAnsi="Garamond" w:cs="Big Caslon Medium"/>
-          <w:kern w:val="0"/>
-          <w:sz w:val="23"/>
-          <w:szCs w:val="23"/>
-        </w:rPr>
-        <w:t>End date:</w:t>
-      </w:r>
-      <w:r>
-        <w:rPr>
-          <w:rFonts w:ascii="Garamond" w:eastAsia="Calibri" w:hAnsi="Garamond" w:cs="Big Caslon Medium"/>
-          <w:kern w:val="0"/>
-          <w:sz w:val="23"/>
-          <w:szCs w:val="23"/>
-        </w:rPr>
-        <w:t xml:space="preserve"> </w:t>
-      </w:r>
-      <w:r>
-        <w:rPr>
-          <w:rFonts w:ascii="Garamond" w:eastAsia="Calibri" w:hAnsi="Garamond" w:cs="Big Caslon Medium"/>
-          <w:kern w:val="0"/>
-          <w:sz w:val="23"/>
-          <w:szCs w:val="23"/>
-        </w:rPr>
-        <w:t>08/</w:t>
-      </w:r>
-      <w:r>
-        <w:rPr>
-          <w:rFonts w:ascii="Garamond" w:eastAsia="Calibri" w:hAnsi="Garamond" w:cs="Big Caslon Medium"/>
-          <w:kern w:val="0"/>
-          <w:sz w:val="23"/>
-          <w:szCs w:val="23"/>
-        </w:rPr>
-        <w:t>2018</w:t>
-      </w:r>
-    </w:p>
-    <w:p>
-      <w:pPr>
-        <w:rPr>
-          <w:rFonts w:ascii="Garamond" w:eastAsia="Calibri" w:hAnsi="Garamond" w:cs="Big Caslon Medium"/>
-          <w:kern w:val="0"/>
-          <w:sz w:val="23"/>
-          <w:szCs w:val="23"/>
-        </w:rPr>
-      </w:pPr>
-      <w:r>
-        <w:rPr>
-          <w:rFonts w:ascii="Garamond" w:eastAsia="Calibri" w:hAnsi="Garamond" w:cs="Big Caslon Medium"/>
-          <w:kern w:val="0"/>
-          <w:sz w:val="23"/>
-          <w:szCs w:val="23"/>
-        </w:rPr>
-        <w:t>Salary: 19.32 USD bi-weekly</w:t>
-      </w:r>
-    </w:p>
-    <w:p>
-      <w:pPr>
-        <w:rPr>
-          <w:rFonts w:ascii="Garamond" w:eastAsia="Calibri" w:hAnsi="Garamond" w:cs="Big Caslon Medium"/>
-          <w:kern w:val="0"/>
-          <w:sz w:val="23"/>
-          <w:szCs w:val="23"/>
-        </w:rPr>
-      </w:pPr>
-      <w:r>
-        <w:rPr>
-          <w:rFonts w:ascii="Garamond" w:eastAsia="Calibri" w:hAnsi="Garamond" w:cs="Big Caslon Medium"/>
-          <w:kern w:val="0"/>
-          <w:sz w:val="23"/>
-          <w:szCs w:val="23"/>
-        </w:rPr>
+      <w:pPr/>
+      <w:r>
+        <w:t>Hampton, VA 23666 United States</w:t>
+      </w:r>
+    </w:p>
+    <w:p>
+      <w:pPr/>
+      <w:r>
+        <w:t>https://www.te.com/usa-en/home.html</w:t>
+      </w:r>
+    </w:p>
+    <w:p>
+      <w:pPr/>
+      <w:r>
+        <w:t>Start date: 08/2006</w:t>
+      </w:r>
+    </w:p>
+    <w:p>
+      <w:pPr/>
+      <w:r>
+        <w:t>End date: 08/2018</w:t>
+      </w:r>
+    </w:p>
+    <w:p>
+      <w:pPr/>
+      <w:r>
+        <w:t>Salary: 19.32 USD per hour</w:t>
+      </w:r>
+    </w:p>
+    <w:p>
+      <w:pPr/>
+      <w:r>
         <w:t>Hours per week: 40</w:t>
       </w:r>
     </w:p>
     <w:p>
-      <w:pPr>
-        <w:rPr>
-          <w:rFonts w:ascii="Garamond" w:eastAsia="Calibri" w:hAnsi="Garamond" w:cs="Big Caslon Medium"/>
-          <w:kern w:val="0"/>
-          <w:sz w:val="23"/>
-          <w:szCs w:val="23"/>
-        </w:rPr>
-        <w:sectPr>
-          <w:type w:val="continuous"/>
-          <w:pgSz w:w="12240" w:h="15840"/>
-          <w:pgMar w:top="720" w:right="720" w:bottom="288" w:left="720" w:header="720" w:footer="720" w:gutter="0"/>
-          <w:cols w:num="2" w:space="720"/>
-          <w:titlePg/>
-          <w:docGrid w:linePitch="360"/>
-        </w:sectPr>
-      </w:pPr>
-    </w:p>
-    <w:p>
-      <w:pPr>
-        <w:rPr>
-          <w:rFonts w:ascii="Garamond" w:eastAsia="Calibri" w:hAnsi="Garamond" w:cs="Big Caslon Medium"/>
-          <w:b/>
-          <w:bCs/>
-          <w:kern w:val="0"/>
-          <w:sz w:val="23"/>
-          <w:szCs w:val="23"/>
-        </w:rPr>
-      </w:pPr>
-      <w:r>
-        <w:rPr>
-          <w:rFonts w:ascii="Garamond" w:eastAsia="Calibri" w:hAnsi="Garamond" w:cs="Big Caslon Medium"/>
-          <w:b/>
-          <w:bCs/>
-          <w:kern w:val="0"/>
-          <w:sz w:val="23"/>
-          <w:szCs w:val="23"/>
-        </w:rPr>
-        <w:lastRenderedPageBreak/>
+      <w:pPr/>
+    </w:p>
+    <w:p>
+      <w:pPr/>
+      <w:r>
         <w:t>Assembler IV</w:t>
       </w:r>
     </w:p>
     <w:p>
-      <w:pPr>
-        <w:rPr>
-          <w:rFonts w:ascii="Garamond" w:eastAsia="Calibri" w:hAnsi="Garamond" w:cs="Big Caslon Medium"/>
-          <w:b/>
-          <w:bCs/>
-          <w:kern w:val="0"/>
-          <w:sz w:val="23"/>
-          <w:szCs w:val="23"/>
-        </w:rPr>
-      </w:pPr>
-      <w:r>
-        <w:rPr>
-          <w:rFonts w:ascii="Garamond" w:eastAsia="Calibri" w:hAnsi="Garamond" w:cs="Big Caslon Medium"/>
-          <w:b/>
-          <w:bCs/>
-          <w:kern w:val="0"/>
-          <w:sz w:val="23"/>
-          <w:szCs w:val="23"/>
-        </w:rPr>
+      <w:pPr/>
+      <w:r>
         <w:t>Duties, Accomplishments, and Related Skills:</w:t>
       </w:r>
     </w:p>
     <w:p>
       <w:pPr>
         <w:pStyle w:val="ListParagraph"/>
-        <w:numPr>
-          <w:ilvl w:val="0"/>
-          <w:numId w:val="40"/>
-        </w:numPr>
-        <w:jc w:val="both"/>
-        <w:rPr>
-          <w:rFonts w:ascii="Garamond" w:eastAsia="Calibri" w:hAnsi="Garamond" w:cs="Big Caslon Medium"/>
-          <w:kern w:val="0"/>
-          <w:sz w:val="23"/>
-          <w:szCs w:val="23"/>
-        </w:rPr>
-      </w:pPr>
-      <w:r>
-        <w:rPr>
-          <w:rFonts w:ascii="Garamond" w:eastAsia="Calibri" w:hAnsi="Garamond" w:cs="Big Caslon Medium"/>
-          <w:kern w:val="0"/>
-          <w:sz w:val="23"/>
-          <w:szCs w:val="23"/>
-        </w:rPr>
+      </w:pPr>
+      <w:r>
         <w:t>Helped develop a Service Life Extension Program (SLEP) for products which were nearing product end of support</w:t>
       </w:r>
     </w:p>
     <w:p>
       <w:pPr>
         <w:pStyle w:val="ListParagraph"/>
-        <w:numPr>
-          <w:ilvl w:val="0"/>
-          <w:numId w:val="40"/>
-        </w:numPr>
-        <w:jc w:val="both"/>
-        <w:rPr>
-          <w:rFonts w:ascii="Garamond" w:eastAsia="Calibri" w:hAnsi="Garamond" w:cs="Big Caslon Medium"/>
-          <w:kern w:val="0"/>
-          <w:sz w:val="23"/>
-          <w:szCs w:val="23"/>
-        </w:rPr>
-      </w:pPr>
-      <w:r>
-        <w:rPr>
-          <w:rFonts w:ascii="Garamond" w:eastAsia="Calibri" w:hAnsi="Garamond" w:cs="Big Caslon Medium"/>
-          <w:kern w:val="0"/>
-          <w:sz w:val="23"/>
-          <w:szCs w:val="23"/>
-        </w:rPr>
-        <w:t xml:space="preserve">Performed advanced troubleshooting techniques down to </w:t>
-      </w:r>
-      <w:r>
-        <w:rPr>
-          <w:rFonts w:ascii="Garamond" w:eastAsia="Calibri" w:hAnsi="Garamond" w:cs="Big Caslon Medium"/>
-          <w:kern w:val="0"/>
-          <w:sz w:val="23"/>
-          <w:szCs w:val="23"/>
-        </w:rPr>
-        <w:t xml:space="preserve">the </w:t>
-      </w:r>
-      <w:r>
-        <w:rPr>
-          <w:rFonts w:ascii="Garamond" w:eastAsia="Calibri" w:hAnsi="Garamond" w:cs="Big Caslon Medium"/>
-          <w:kern w:val="0"/>
-          <w:sz w:val="23"/>
-          <w:szCs w:val="23"/>
-        </w:rPr>
-        <w:t>component level on microelectronic devices</w:t>
+      </w:pPr>
+      <w:r>
+        <w:t>Performed advanced troubleshooting techniques down to the component level on microelectronic devices</w:t>
       </w:r>
     </w:p>
     <w:p>
       <w:pPr>
         <w:pStyle w:val="ListParagraph"/>
-        <w:numPr>
-          <w:ilvl w:val="0"/>
-          <w:numId w:val="40"/>
-        </w:numPr>
-        <w:jc w:val="both"/>
-        <w:rPr>
-          <w:rFonts w:ascii="Garamond" w:eastAsia="Calibri" w:hAnsi="Garamond" w:cs="Big Caslon Medium"/>
-          <w:kern w:val="0"/>
-          <w:sz w:val="23"/>
-          <w:szCs w:val="23"/>
-        </w:rPr>
-      </w:pPr>
-      <w:r>
-        <w:rPr>
-          <w:rFonts w:ascii="Garamond" w:eastAsia="Calibri" w:hAnsi="Garamond" w:cs="Big Caslon Medium"/>
-          <w:kern w:val="0"/>
-          <w:sz w:val="23"/>
-          <w:szCs w:val="23"/>
-        </w:rPr>
-        <w:t>Utilized</w:t>
-      </w:r>
-      <w:r>
-        <w:rPr>
-          <w:rFonts w:ascii="Garamond" w:eastAsia="Calibri" w:hAnsi="Garamond" w:cs="Big Caslon Medium"/>
-          <w:kern w:val="0"/>
-          <w:sz w:val="23"/>
-          <w:szCs w:val="23"/>
-        </w:rPr>
-        <w:t xml:space="preserve"> schematics, technical drawings, and applied logical knowledge in the repair of ten types of air pressure scanners</w:t>
+      </w:pPr>
+      <w:r>
+        <w:t>Utilized schematics, technical drawings, and applied logical knowledge in the repair of ten types of air pressure scanners</w:t>
       </w:r>
     </w:p>
     <w:p>
       <w:pPr>
         <w:pStyle w:val="ListParagraph"/>
-        <w:numPr>
-          <w:ilvl w:val="0"/>
-          <w:numId w:val="40"/>
-        </w:numPr>
-        <w:jc w:val="both"/>
-        <w:rPr>
-          <w:rFonts w:ascii="Garamond" w:eastAsia="Calibri" w:hAnsi="Garamond" w:cs="Big Caslon Medium"/>
-          <w:kern w:val="0"/>
-          <w:sz w:val="23"/>
-          <w:szCs w:val="23"/>
-        </w:rPr>
-      </w:pPr>
-      <w:r>
-        <w:rPr>
-          <w:rFonts w:ascii="Garamond" w:eastAsia="Calibri" w:hAnsi="Garamond" w:cs="Big Caslon Medium"/>
-          <w:kern w:val="0"/>
-          <w:sz w:val="23"/>
-          <w:szCs w:val="23"/>
-        </w:rPr>
-        <w:t>M</w:t>
-      </w:r>
-      <w:r>
-        <w:rPr>
-          <w:rFonts w:ascii="Garamond" w:eastAsia="Calibri" w:hAnsi="Garamond" w:cs="Big Caslon Medium"/>
-          <w:kern w:val="0"/>
-          <w:sz w:val="23"/>
-          <w:szCs w:val="23"/>
-        </w:rPr>
-        <w:t xml:space="preserve">aintained test equipment </w:t>
-      </w:r>
-      <w:r>
-        <w:rPr>
-          <w:rFonts w:ascii="Garamond" w:eastAsia="Calibri" w:hAnsi="Garamond" w:cs="Big Caslon Medium"/>
-          <w:kern w:val="0"/>
-          <w:sz w:val="23"/>
-          <w:szCs w:val="23"/>
-        </w:rPr>
-        <w:t>including calibration cycles</w:t>
+      </w:pPr>
+      <w:r>
+        <w:t>Maintained test equipment including calibration cycles</w:t>
       </w:r>
     </w:p>
     <w:p>
       <w:pPr>
         <w:pStyle w:val="ListParagraph"/>
-        <w:numPr>
-          <w:ilvl w:val="0"/>
-          <w:numId w:val="40"/>
-        </w:numPr>
-        <w:jc w:val="both"/>
-        <w:rPr>
-          <w:rFonts w:ascii="Garamond" w:eastAsia="Calibri" w:hAnsi="Garamond" w:cs="Big Caslon Medium"/>
-          <w:kern w:val="0"/>
-          <w:sz w:val="23"/>
-          <w:szCs w:val="23"/>
-        </w:rPr>
-      </w:pPr>
-      <w:r>
-        <w:rPr>
-          <w:rFonts w:ascii="Garamond" w:eastAsia="Calibri" w:hAnsi="Garamond" w:cs="Big Caslon Medium"/>
-          <w:kern w:val="0"/>
-          <w:sz w:val="23"/>
-          <w:szCs w:val="23"/>
-        </w:rPr>
+      </w:pPr>
+      <w:r>
         <w:t>Performed calibration and accuracy testing on pressure sensors ranging from -12 to 750 pounds per square inch</w:t>
       </w:r>
     </w:p>
     <w:p>
       <w:pPr>
         <w:pStyle w:val="ListParagraph"/>
-        <w:numPr>
-          <w:ilvl w:val="0"/>
-          <w:numId w:val="40"/>
-        </w:numPr>
-        <w:jc w:val="both"/>
-        <w:rPr>
-          <w:rFonts w:ascii="Garamond" w:eastAsia="Calibri" w:hAnsi="Garamond" w:cs="Big Caslon Medium"/>
-          <w:kern w:val="0"/>
-          <w:sz w:val="23"/>
-          <w:szCs w:val="23"/>
-        </w:rPr>
-      </w:pPr>
-      <w:r>
-        <w:rPr>
-          <w:rFonts w:ascii="Garamond" w:eastAsia="Calibri" w:hAnsi="Garamond" w:cs="Big Caslon Medium"/>
-          <w:kern w:val="0"/>
-          <w:sz w:val="23"/>
-          <w:szCs w:val="23"/>
-        </w:rPr>
-        <w:t>T</w:t>
-      </w:r>
-      <w:r>
-        <w:rPr>
-          <w:rFonts w:ascii="Garamond" w:eastAsia="Calibri" w:hAnsi="Garamond" w:cs="Big Caslon Medium"/>
-          <w:kern w:val="0"/>
-          <w:sz w:val="23"/>
-          <w:szCs w:val="23"/>
-        </w:rPr>
-        <w:t>ested air pressure sensors using proprietary software</w:t>
+      </w:pPr>
+      <w:r>
+        <w:t>Tested air pressure sensors using proprietary software</w:t>
       </w:r>
     </w:p>
     <w:p>
       <w:pPr>
         <w:pStyle w:val="ListParagraph"/>
-        <w:numPr>
-          <w:ilvl w:val="0"/>
-          <w:numId w:val="40"/>
-        </w:numPr>
-        <w:jc w:val="both"/>
-        <w:rPr>
-          <w:rFonts w:ascii="Garamond" w:eastAsia="Calibri" w:hAnsi="Garamond" w:cs="Big Caslon Medium"/>
-          <w:kern w:val="0"/>
-          <w:sz w:val="23"/>
-          <w:szCs w:val="23"/>
-        </w:rPr>
-      </w:pPr>
-      <w:r>
-        <w:rPr>
-          <w:rFonts w:ascii="Garamond" w:eastAsia="Calibri" w:hAnsi="Garamond" w:cs="Big Caslon Medium"/>
-          <w:kern w:val="0"/>
-          <w:sz w:val="23"/>
-          <w:szCs w:val="23"/>
-        </w:rPr>
-        <w:t>Wrote progra</w:t>
-      </w:r>
-      <w:r>
-        <w:rPr>
-          <w:rFonts w:ascii="Garamond" w:eastAsia="Calibri" w:hAnsi="Garamond" w:cs="Big Caslon Medium"/>
-          <w:kern w:val="0"/>
-          <w:sz w:val="23"/>
-          <w:szCs w:val="23"/>
-        </w:rPr>
-        <w:t>m</w:t>
-      </w:r>
-      <w:r>
-        <w:rPr>
-          <w:rFonts w:ascii="Garamond" w:eastAsia="Calibri" w:hAnsi="Garamond" w:cs="Big Caslon Medium"/>
-          <w:kern w:val="0"/>
-          <w:sz w:val="23"/>
-          <w:szCs w:val="23"/>
-        </w:rPr>
-        <w:t>ming modules for use in testing repaired equipment, to help simulate real</w:t>
-      </w:r>
-      <w:r>
-        <w:rPr>
-          <w:rFonts w:ascii="Garamond" w:eastAsia="Calibri" w:hAnsi="Garamond" w:cs="Big Caslon Medium"/>
-          <w:kern w:val="0"/>
-          <w:sz w:val="23"/>
-          <w:szCs w:val="23"/>
-        </w:rPr>
-        <w:t>-</w:t>
-      </w:r>
-      <w:r>
-        <w:rPr>
-          <w:rFonts w:ascii="Garamond" w:eastAsia="Calibri" w:hAnsi="Garamond" w:cs="Big Caslon Medium"/>
-          <w:kern w:val="0"/>
-          <w:sz w:val="23"/>
-          <w:szCs w:val="23"/>
-        </w:rPr>
-        <w:t>world environments, for quality assurance and customer confidence</w:t>
+      </w:pPr>
+      <w:r>
+        <w:t>Wrote programming modules for use in testing repaired equipment, to help simulate real-world environments, for quality assurance and customer confidence</w:t>
       </w:r>
     </w:p>
     <w:p>
       <w:pPr>
         <w:pStyle w:val="ListParagraph"/>
-        <w:numPr>
-          <w:ilvl w:val="0"/>
-          <w:numId w:val="40"/>
-        </w:numPr>
-        <w:jc w:val="both"/>
-        <w:rPr>
-          <w:rFonts w:ascii="Garamond" w:hAnsi="Garamond"/>
-          <w:sz w:val="23"/>
-          <w:szCs w:val="23"/>
-        </w:rPr>
-      </w:pPr>
-      <w:r>
-        <w:rPr>
-          <w:rFonts w:ascii="Garamond" w:eastAsia="Calibri" w:hAnsi="Garamond" w:cs="Big Caslon Medium"/>
-          <w:kern w:val="0"/>
-          <w:sz w:val="23"/>
-          <w:szCs w:val="23"/>
-        </w:rPr>
+      </w:pPr>
+      <w:r>
         <w:t>Documented failures, both with pictures and data, of newly built sensors for review by applications engineering, quality assurance, and systems engineering</w:t>
       </w:r>
     </w:p>
     <w:p>
       <w:pPr>
         <w:pStyle w:val="ListParagraph"/>
-        <w:numPr>
-          <w:ilvl w:val="0"/>
-          <w:numId w:val="40"/>
-        </w:numPr>
-        <w:jc w:val="both"/>
-        <w:rPr>
-          <w:rFonts w:ascii="Garamond" w:hAnsi="Garamond"/>
-          <w:sz w:val="23"/>
-          <w:szCs w:val="23"/>
-        </w:rPr>
-      </w:pPr>
-      <w:r>
-        <w:rPr>
-          <w:rFonts w:ascii="Garamond" w:eastAsia="Calibri" w:hAnsi="Garamond" w:cs="Big Caslon Medium"/>
-          <w:kern w:val="0"/>
-          <w:sz w:val="23"/>
-          <w:szCs w:val="23"/>
-        </w:rPr>
+      </w:pPr>
+      <w:r>
         <w:t>Assisted with technical support during new product testing</w:t>
       </w:r>
     </w:p>
     <w:p>
       <w:pPr>
         <w:pStyle w:val="ListParagraph"/>
-        <w:numPr>
-          <w:ilvl w:val="0"/>
-          <w:numId w:val="40"/>
-        </w:numPr>
-        <w:jc w:val="both"/>
-        <w:rPr>
-          <w:rFonts w:ascii="Garamond" w:hAnsi="Garamond"/>
-          <w:sz w:val="23"/>
-          <w:szCs w:val="23"/>
-        </w:rPr>
-      </w:pPr>
-      <w:r>
-        <w:rPr>
-          <w:rFonts w:ascii="Garamond" w:eastAsia="Calibri" w:hAnsi="Garamond" w:cs="Big Caslon Medium"/>
-          <w:kern w:val="0"/>
-          <w:sz w:val="23"/>
-          <w:szCs w:val="23"/>
-        </w:rPr>
-        <w:t>Presented reports during daily or weekly meetings</w:t>
-      </w:r>
-      <w:r>
-        <w:rPr>
-          <w:rFonts w:ascii="Garamond" w:eastAsia="Calibri" w:hAnsi="Garamond" w:cs="Big Caslon Medium"/>
-          <w:kern w:val="0"/>
-          <w:sz w:val="23"/>
-          <w:szCs w:val="23"/>
-        </w:rPr>
-        <w:t xml:space="preserve"> </w:t>
-      </w:r>
-      <w:r>
-        <w:rPr>
-          <w:rFonts w:ascii="Garamond" w:eastAsia="Calibri" w:hAnsi="Garamond" w:cs="Big Caslon Medium"/>
-          <w:kern w:val="0"/>
-          <w:sz w:val="23"/>
-          <w:szCs w:val="23"/>
-        </w:rPr>
-        <w:t>as needed</w:t>
-      </w:r>
-    </w:p>
-    <w:p>
-      <w:pPr>
-        <w:overflowPunct/>
-        <w:autoSpaceDE w:val="0"/>
-        <w:autoSpaceDN w:val="0"/>
-        <w:jc w:val="both"/>
-        <w:rPr>
-          <w:rFonts w:ascii="Garamond" w:eastAsia="Calibri" w:hAnsi="Garamond" w:cs="Big Caslon Medium"/>
-          <w:bCs/>
-          <w:iCs/>
-          <w:kern w:val="0"/>
-          <w:sz w:val="23"/>
-          <w:szCs w:val="23"/>
-        </w:rPr>
-      </w:pPr>
-      <w:r>
-        <w:rPr>
-          <w:rFonts w:ascii="Garamond" w:eastAsia="Calibri" w:hAnsi="Garamond" w:cs="Big Caslon Medium"/>
-          <w:b/>
-          <w:iCs/>
-          <w:kern w:val="0"/>
-          <w:sz w:val="23"/>
-          <w:szCs w:val="23"/>
-        </w:rPr>
-        <w:t>Supervisor:</w:t>
-      </w:r>
-      <w:r>
-        <w:rPr>
-          <w:rFonts w:ascii="Garamond" w:eastAsia="Calibri" w:hAnsi="Garamond" w:cs="Big Caslon Medium"/>
-          <w:bCs/>
-          <w:iCs/>
-          <w:kern w:val="0"/>
-          <w:sz w:val="23"/>
-          <w:szCs w:val="23"/>
-        </w:rPr>
-        <w:t xml:space="preserve"> Martin Walker (7577661500)</w:t>
-      </w:r>
-    </w:p>
-    <w:p>
-      <w:pPr>
-        <w:pBdr>
-          <w:bottom w:val="single" w:sz="12" w:space="1" w:color="BFBFBF" w:themeColor="background1" w:themeShade="BF"/>
-        </w:pBdr>
-        <w:overflowPunct/>
-        <w:autoSpaceDE w:val="0"/>
-        <w:autoSpaceDN w:val="0"/>
-        <w:jc w:val="both"/>
-        <w:rPr>
-          <w:rFonts w:ascii="Garamond" w:eastAsia="Calibri" w:hAnsi="Garamond" w:cs="Big Caslon Medium"/>
-          <w:bCs/>
-          <w:iCs/>
-          <w:kern w:val="0"/>
-          <w:sz w:val="23"/>
-          <w:szCs w:val="23"/>
-        </w:rPr>
-      </w:pPr>
-      <w:r>
-        <w:rPr>
-          <w:rFonts w:ascii="Garamond" w:eastAsia="Calibri" w:hAnsi="Garamond" w:cs="Big Caslon Medium"/>
-          <w:b/>
-          <w:iCs/>
-          <w:kern w:val="0"/>
-          <w:sz w:val="23"/>
-          <w:szCs w:val="23"/>
-        </w:rPr>
-        <w:t>Okay to contact this Supervisor:</w:t>
-      </w:r>
-      <w:r>
-        <w:rPr>
-          <w:rFonts w:ascii="Garamond" w:eastAsia="Calibri" w:hAnsi="Garamond" w:cs="Big Caslon Medium"/>
-          <w:bCs/>
-          <w:iCs/>
-          <w:kern w:val="0"/>
-          <w:sz w:val="23"/>
-          <w:szCs w:val="23"/>
-        </w:rPr>
-        <w:t xml:space="preserve"> Yes</w:t>
-      </w:r>
-    </w:p>
-    <w:p>
-      <w:pPr>
-        <w:overflowPunct/>
-        <w:autoSpaceDE w:val="0"/>
-        <w:autoSpaceDN w:val="0"/>
-        <w:jc w:val="both"/>
-        <w:rPr>
-          <w:rFonts w:ascii="Garamond" w:eastAsia="Calibri" w:hAnsi="Garamond" w:cs="Big Caslon Medium"/>
-          <w:bCs/>
-          <w:iCs/>
-          <w:kern w:val="0"/>
-          <w:sz w:val="23"/>
-          <w:szCs w:val="23"/>
-        </w:rPr>
-      </w:pPr>
-    </w:p>
-    <w:p>
-      <w:pPr>
-        <w:rPr>
-          <w:rFonts w:ascii="Garamond" w:eastAsia="Calibri" w:hAnsi="Garamond" w:cs="Big Caslon Medium"/>
-          <w:b/>
-          <w:bCs/>
-          <w:kern w:val="0"/>
-          <w:sz w:val="23"/>
-          <w:szCs w:val="23"/>
-        </w:rPr>
-        <w:sectPr>
-          <w:type w:val="continuous"/>
-          <w:pgSz w:w="12240" w:h="15840"/>
-          <w:pgMar w:top="720" w:right="720" w:bottom="288" w:left="720" w:header="720" w:footer="720" w:gutter="0"/>
-          <w:cols w:space="720"/>
-          <w:titlePg/>
-          <w:docGrid w:linePitch="360"/>
-        </w:sectPr>
-      </w:pPr>
-    </w:p>
-    <w:p>
-      <w:pPr>
-        <w:rPr>
-          <w:rFonts w:ascii="Garamond" w:eastAsia="Calibri" w:hAnsi="Garamond" w:cs="Big Caslon Medium"/>
-          <w:b/>
-          <w:bCs/>
-          <w:kern w:val="0"/>
-          <w:sz w:val="23"/>
-          <w:szCs w:val="23"/>
-        </w:rPr>
-      </w:pPr>
-      <w:r>
-        <w:rPr>
-          <w:rFonts w:ascii="Garamond" w:eastAsia="Calibri" w:hAnsi="Garamond" w:cs="Big Caslon Medium"/>
-          <w:b/>
-          <w:bCs/>
-          <w:kern w:val="0"/>
-          <w:sz w:val="23"/>
-          <w:szCs w:val="23"/>
-        </w:rPr>
+      </w:pPr>
+      <w:r>
+        <w:t>Presented reports during daily or weekly meetings as needed</w:t>
+      </w:r>
+    </w:p>
+    <w:p>
+      <w:pPr/>
+      <w:r>
+        <w:t>Supervisor: Martin Walker (7577661500)</w:t>
+      </w:r>
+    </w:p>
+    <w:p>
+      <w:pPr/>
+      <w:r>
+        <w:t>Okay to contact this Supervisor: Yes</w:t>
+      </w:r>
+    </w:p>
+    <w:p>
+      <w:pPr/>
+    </w:p>
+    <w:p>
+      <w:pPr/>
+      <w:r>
         <w:t>U.S. Marine Corps.</w:t>
       </w:r>
     </w:p>
     <w:p>
-      <w:pPr>
-        <w:rPr>
-          <w:rFonts w:ascii="Garamond" w:eastAsia="Calibri" w:hAnsi="Garamond" w:cs="Big Caslon Medium"/>
-          <w:kern w:val="0"/>
-          <w:sz w:val="23"/>
-          <w:szCs w:val="23"/>
-        </w:rPr>
-      </w:pPr>
-      <w:r>
-        <w:rPr>
-          <w:rFonts w:ascii="Garamond" w:eastAsia="Calibri" w:hAnsi="Garamond" w:cs="Big Caslon Medium"/>
-          <w:kern w:val="0"/>
-          <w:sz w:val="23"/>
-          <w:szCs w:val="23"/>
-        </w:rPr>
+      <w:pPr/>
+      <w:r>
         <w:t>MACS-2 MCAS Cherry Point</w:t>
       </w:r>
     </w:p>
     <w:p>
-      <w:pPr>
-        <w:rPr>
-          <w:rFonts w:ascii="Garamond" w:eastAsia="Calibri" w:hAnsi="Garamond" w:cs="Big Caslon Medium"/>
-          <w:kern w:val="0"/>
-          <w:sz w:val="23"/>
-          <w:szCs w:val="23"/>
-        </w:rPr>
-      </w:pPr>
-      <w:r>
-        <w:rPr>
-          <w:rFonts w:ascii="Garamond" w:eastAsia="Calibri" w:hAnsi="Garamond" w:cs="Big Caslon Medium"/>
-          <w:kern w:val="0"/>
-          <w:sz w:val="23"/>
-          <w:szCs w:val="23"/>
-        </w:rPr>
-        <w:t>Cherry Point,</w:t>
-      </w:r>
-      <w:r>
-        <w:rPr>
-          <w:rFonts w:ascii="Garamond" w:eastAsia="Calibri" w:hAnsi="Garamond" w:cs="Big Caslon Medium"/>
-          <w:kern w:val="0"/>
-          <w:sz w:val="23"/>
-          <w:szCs w:val="23"/>
-        </w:rPr>
-        <w:t xml:space="preserve"> </w:t>
-      </w:r>
-      <w:r>
-        <w:rPr>
-          <w:rFonts w:ascii="Garamond" w:eastAsia="Calibri" w:hAnsi="Garamond" w:cs="Big Caslon Medium"/>
-          <w:kern w:val="0"/>
-          <w:sz w:val="23"/>
-          <w:szCs w:val="23"/>
-        </w:rPr>
-        <w:t>NC</w:t>
-      </w:r>
-      <w:r>
-        <w:rPr>
-          <w:rFonts w:ascii="Garamond" w:eastAsia="Calibri" w:hAnsi="Garamond" w:cs="Big Caslon Medium"/>
-          <w:kern w:val="0"/>
-          <w:sz w:val="23"/>
-          <w:szCs w:val="23"/>
-        </w:rPr>
-        <w:t xml:space="preserve"> </w:t>
-      </w:r>
-      <w:r>
-        <w:rPr>
-          <w:rFonts w:ascii="Garamond" w:eastAsia="Calibri" w:hAnsi="Garamond" w:cs="Big Caslon Medium"/>
-          <w:kern w:val="0"/>
-          <w:sz w:val="23"/>
-          <w:szCs w:val="23"/>
-        </w:rPr>
-        <w:t>28533</w:t>
-      </w:r>
-      <w:r>
-        <w:rPr>
-          <w:rFonts w:ascii="Garamond" w:eastAsia="Calibri" w:hAnsi="Garamond" w:cs="Big Caslon Medium"/>
-          <w:kern w:val="0"/>
-          <w:sz w:val="23"/>
-          <w:szCs w:val="23"/>
-        </w:rPr>
-        <w:t xml:space="preserve"> </w:t>
-      </w:r>
-      <w:r>
-        <w:rPr>
-          <w:rFonts w:ascii="Garamond" w:eastAsia="Calibri" w:hAnsi="Garamond" w:cs="Big Caslon Medium"/>
-          <w:kern w:val="0"/>
-          <w:sz w:val="23"/>
-          <w:szCs w:val="23"/>
-        </w:rPr>
-        <w:t>United States</w:t>
-      </w:r>
-    </w:p>
-    <w:p>
-      <w:pPr>
-        <w:rPr>
-          <w:rFonts w:ascii="Garamond" w:eastAsia="Calibri" w:hAnsi="Garamond" w:cs="Big Caslon Medium"/>
-          <w:kern w:val="0"/>
-          <w:sz w:val="23"/>
-          <w:szCs w:val="23"/>
-        </w:rPr>
-      </w:pPr>
-    </w:p>
-    <w:p>
-      <w:pPr>
-        <w:rPr>
-          <w:rFonts w:ascii="Garamond" w:eastAsia="Calibri" w:hAnsi="Garamond" w:cs="Big Caslon Medium"/>
-          <w:kern w:val="0"/>
-          <w:sz w:val="23"/>
-          <w:szCs w:val="23"/>
-        </w:rPr>
-      </w:pPr>
-      <w:r>
-        <w:rPr>
-          <w:rFonts w:ascii="Garamond" w:eastAsia="Calibri" w:hAnsi="Garamond" w:cs="Big Caslon Medium"/>
-          <w:kern w:val="0"/>
-          <w:sz w:val="23"/>
-          <w:szCs w:val="23"/>
-        </w:rPr>
-        <w:t xml:space="preserve">Start date: </w:t>
-      </w:r>
-      <w:r>
-        <w:rPr>
-          <w:rFonts w:ascii="Garamond" w:eastAsia="Calibri" w:hAnsi="Garamond" w:cs="Big Caslon Medium"/>
-          <w:kern w:val="0"/>
-          <w:sz w:val="23"/>
-          <w:szCs w:val="23"/>
-        </w:rPr>
-        <w:t>06/2001</w:t>
-      </w:r>
-    </w:p>
-    <w:p>
-      <w:pPr>
-        <w:rPr>
-          <w:rFonts w:ascii="Garamond" w:eastAsia="Calibri" w:hAnsi="Garamond" w:cs="Big Caslon Medium"/>
-          <w:kern w:val="0"/>
-          <w:sz w:val="23"/>
-          <w:szCs w:val="23"/>
-        </w:rPr>
-      </w:pPr>
-      <w:r>
-        <w:rPr>
-          <w:rFonts w:ascii="Garamond" w:eastAsia="Calibri" w:hAnsi="Garamond" w:cs="Big Caslon Medium"/>
-          <w:kern w:val="0"/>
-          <w:sz w:val="23"/>
-          <w:szCs w:val="23"/>
-        </w:rPr>
-        <w:t xml:space="preserve">End date: </w:t>
-      </w:r>
-      <w:r>
-        <w:rPr>
-          <w:rFonts w:ascii="Garamond" w:eastAsia="Calibri" w:hAnsi="Garamond" w:cs="Big Caslon Medium"/>
-          <w:kern w:val="0"/>
-          <w:sz w:val="23"/>
-          <w:szCs w:val="23"/>
-        </w:rPr>
-        <w:t>06/2006</w:t>
-      </w:r>
-    </w:p>
-    <w:p>
-      <w:pPr>
-        <w:rPr>
-          <w:rFonts w:ascii="Garamond" w:eastAsia="Calibri" w:hAnsi="Garamond" w:cs="Big Caslon Medium"/>
-          <w:kern w:val="0"/>
-          <w:sz w:val="23"/>
-          <w:szCs w:val="23"/>
-        </w:rPr>
-      </w:pPr>
-      <w:r>
-        <w:rPr>
-          <w:rFonts w:ascii="Garamond" w:eastAsia="Calibri" w:hAnsi="Garamond" w:cs="Big Caslon Medium"/>
-          <w:kern w:val="0"/>
-          <w:sz w:val="23"/>
-          <w:szCs w:val="23"/>
-        </w:rPr>
-        <w:t>Hours per week:</w:t>
-      </w:r>
-      <w:r>
-        <w:rPr>
-          <w:rFonts w:ascii="Garamond" w:eastAsia="Calibri" w:hAnsi="Garamond" w:cs="Big Caslon Medium"/>
-          <w:kern w:val="0"/>
-          <w:sz w:val="23"/>
-          <w:szCs w:val="23"/>
-        </w:rPr>
-        <w:t xml:space="preserve"> </w:t>
-      </w:r>
-      <w:r>
-        <w:rPr>
-          <w:rFonts w:ascii="Garamond" w:eastAsia="Calibri" w:hAnsi="Garamond" w:cs="Big Caslon Medium"/>
-          <w:kern w:val="0"/>
-          <w:sz w:val="23"/>
-          <w:szCs w:val="23"/>
-        </w:rPr>
-        <w:t>40</w:t>
-      </w:r>
-    </w:p>
-    <w:p>
-      <w:pPr>
-        <w:rPr>
-          <w:rFonts w:ascii="Garamond" w:eastAsia="Calibri" w:hAnsi="Garamond" w:cs="Big Caslon Medium"/>
-          <w:kern w:val="0"/>
-          <w:sz w:val="23"/>
-          <w:szCs w:val="23"/>
-        </w:rPr>
-        <w:sectPr>
-          <w:type w:val="continuous"/>
-          <w:pgSz w:w="12240" w:h="15840"/>
-          <w:pgMar w:top="720" w:right="720" w:bottom="288" w:left="720" w:header="720" w:footer="720" w:gutter="0"/>
-          <w:cols w:num="2" w:space="720"/>
-          <w:titlePg/>
-          <w:docGrid w:linePitch="360"/>
-        </w:sectPr>
-      </w:pPr>
-    </w:p>
-    <w:p>
-      <w:pPr>
-        <w:rPr>
-          <w:rFonts w:ascii="Garamond" w:eastAsia="Calibri" w:hAnsi="Garamond" w:cs="Big Caslon Medium"/>
-          <w:b/>
-          <w:bCs/>
-          <w:kern w:val="0"/>
-          <w:sz w:val="23"/>
-          <w:szCs w:val="23"/>
-        </w:rPr>
-      </w:pPr>
-      <w:r>
-        <w:rPr>
-          <w:rFonts w:ascii="Garamond" w:eastAsia="Calibri" w:hAnsi="Garamond" w:cs="Big Caslon Medium"/>
-          <w:b/>
-          <w:bCs/>
-          <w:kern w:val="0"/>
-          <w:sz w:val="23"/>
-          <w:szCs w:val="23"/>
-        </w:rPr>
+      <w:pPr/>
+      <w:r>
+        <w:t>Cherry Point, NC 28533 United States</w:t>
+      </w:r>
+    </w:p>
+    <w:p>
+      <w:pPr/>
+    </w:p>
+    <w:p>
+      <w:pPr/>
+      <w:r>
+        <w:t>Start date: 06/2001</w:t>
+      </w:r>
+    </w:p>
+    <w:p>
+      <w:pPr/>
+      <w:r>
+        <w:t>End date: 06/2006</w:t>
+      </w:r>
+    </w:p>
+    <w:p>
+      <w:pPr/>
+      <w:r>
+        <w:t>Hours per week: 40</w:t>
+      </w:r>
+    </w:p>
+    <w:p>
+      <w:pPr/>
+    </w:p>
+    <w:p>
+      <w:pPr/>
+      <w:r>
         <w:t>Aviation Radar Repair - E4 Corporal</w:t>
       </w:r>
     </w:p>
     <w:p>
-      <w:pPr>
-        <w:rPr>
-          <w:rFonts w:ascii="Garamond" w:eastAsia="Calibri" w:hAnsi="Garamond" w:cs="Big Caslon Medium"/>
-          <w:b/>
-          <w:bCs/>
-          <w:kern w:val="0"/>
-          <w:sz w:val="23"/>
-          <w:szCs w:val="23"/>
-        </w:rPr>
-      </w:pPr>
-      <w:r>
-        <w:rPr>
-          <w:rFonts w:ascii="Garamond" w:eastAsia="Calibri" w:hAnsi="Garamond" w:cs="Big Caslon Medium"/>
-          <w:b/>
-          <w:bCs/>
-          <w:kern w:val="0"/>
-          <w:sz w:val="23"/>
-          <w:szCs w:val="23"/>
-        </w:rPr>
+      <w:pPr/>
+      <w:r>
         <w:t>Duties, Accomplishments and Related Skills:</w:t>
       </w:r>
     </w:p>
     <w:p>
       <w:pPr>
         <w:pStyle w:val="ListParagraph"/>
-        <w:numPr>
-          <w:ilvl w:val="0"/>
-          <w:numId w:val="41"/>
-        </w:numPr>
-        <w:rPr>
-          <w:rFonts w:ascii="Garamond" w:eastAsia="Calibri" w:hAnsi="Garamond" w:cs="Big Caslon Medium"/>
-          <w:kern w:val="0"/>
-          <w:sz w:val="23"/>
-          <w:szCs w:val="23"/>
-        </w:rPr>
-      </w:pPr>
-      <w:r>
-        <w:rPr>
-          <w:rFonts w:ascii="Garamond" w:eastAsia="Calibri" w:hAnsi="Garamond" w:cs="Big Caslon Medium"/>
-          <w:kern w:val="0"/>
-          <w:sz w:val="23"/>
-          <w:szCs w:val="23"/>
-        </w:rPr>
+      </w:pPr>
+      <w:r>
         <w:t>Two meritorious promotions for excelling in training</w:t>
       </w:r>
     </w:p>
     <w:p>
       <w:pPr>
         <w:pStyle w:val="ListParagraph"/>
-        <w:numPr>
-          <w:ilvl w:val="0"/>
-          <w:numId w:val="41"/>
-        </w:numPr>
-        <w:rPr>
-          <w:rFonts w:ascii="Garamond" w:eastAsia="Calibri" w:hAnsi="Garamond" w:cs="Big Caslon Medium"/>
-          <w:kern w:val="0"/>
-          <w:sz w:val="23"/>
-          <w:szCs w:val="23"/>
-        </w:rPr>
-      </w:pPr>
-      <w:r>
-        <w:rPr>
-          <w:rFonts w:ascii="Garamond" w:eastAsia="Calibri" w:hAnsi="Garamond" w:cs="Big Caslon Medium"/>
-          <w:kern w:val="0"/>
-          <w:sz w:val="23"/>
-          <w:szCs w:val="23"/>
-        </w:rPr>
-        <w:t xml:space="preserve">Four </w:t>
-      </w:r>
-      <w:r>
-        <w:rPr>
-          <w:rFonts w:ascii="Garamond" w:eastAsia="Calibri" w:hAnsi="Garamond" w:cs="Big Caslon Medium"/>
-          <w:kern w:val="0"/>
-          <w:sz w:val="23"/>
-          <w:szCs w:val="23"/>
-        </w:rPr>
-        <w:t>Certificate of Appreciations</w:t>
+      </w:pPr>
+      <w:r>
+        <w:t>Four Certificate of Appreciations</w:t>
       </w:r>
     </w:p>
     <w:p>
       <w:pPr>
         <w:pStyle w:val="ListParagraph"/>
-        <w:numPr>
-          <w:ilvl w:val="0"/>
-          <w:numId w:val="41"/>
-        </w:numPr>
-        <w:rPr>
-          <w:rFonts w:ascii="Garamond" w:eastAsia="Calibri" w:hAnsi="Garamond" w:cs="Big Caslon Medium"/>
-          <w:kern w:val="0"/>
-          <w:sz w:val="23"/>
-          <w:szCs w:val="23"/>
-        </w:rPr>
-      </w:pPr>
-      <w:r>
-        <w:rPr>
-          <w:rFonts w:ascii="Garamond" w:eastAsia="Calibri" w:hAnsi="Garamond" w:cs="Big Caslon Medium"/>
-          <w:kern w:val="0"/>
-          <w:sz w:val="23"/>
-          <w:szCs w:val="23"/>
-        </w:rPr>
+      </w:pPr>
+      <w:r>
         <w:t>Certificate of Commendation and Meritorious Mast</w:t>
       </w:r>
     </w:p>
     <w:p>
       <w:pPr>
         <w:pStyle w:val="ListParagraph"/>
-        <w:numPr>
-          <w:ilvl w:val="0"/>
-          <w:numId w:val="41"/>
-        </w:numPr>
-        <w:rPr>
-          <w:rFonts w:ascii="Garamond" w:eastAsia="Calibri" w:hAnsi="Garamond" w:cs="Big Caslon Medium"/>
-          <w:kern w:val="0"/>
-          <w:sz w:val="23"/>
-          <w:szCs w:val="23"/>
-        </w:rPr>
-      </w:pPr>
-      <w:r>
-        <w:rPr>
-          <w:rFonts w:ascii="Garamond" w:eastAsia="Calibri" w:hAnsi="Garamond" w:cs="Big Caslon Medium"/>
-          <w:kern w:val="0"/>
-          <w:sz w:val="23"/>
-          <w:szCs w:val="23"/>
-        </w:rPr>
+      </w:pPr>
+      <w:r>
         <w:t>Supervised teams of 5 to 8 members in the training and maintenance of 2 mobile radar systems</w:t>
       </w:r>
     </w:p>
     <w:p>
       <w:pPr>
         <w:pStyle w:val="ListParagraph"/>
-        <w:numPr>
-          <w:ilvl w:val="0"/>
-          <w:numId w:val="41"/>
-        </w:numPr>
-        <w:rPr>
-          <w:rFonts w:ascii="Garamond" w:eastAsia="Calibri" w:hAnsi="Garamond" w:cs="Big Caslon Medium"/>
-          <w:kern w:val="0"/>
-          <w:sz w:val="23"/>
-          <w:szCs w:val="23"/>
-        </w:rPr>
-      </w:pPr>
-      <w:r>
-        <w:rPr>
-          <w:rFonts w:ascii="Garamond" w:eastAsia="Calibri" w:hAnsi="Garamond" w:cs="Big Caslon Medium"/>
-          <w:kern w:val="0"/>
-          <w:sz w:val="23"/>
-          <w:szCs w:val="23"/>
-        </w:rPr>
-        <w:t>Maintained optimal functionality of an electronic system under stressful and demanding situations, including support of</w:t>
-      </w:r>
-      <w:r>
-        <w:rPr>
-          <w:rFonts w:ascii="Garamond" w:eastAsia="Calibri" w:hAnsi="Garamond" w:cs="Big Caslon Medium"/>
-          <w:kern w:val="0"/>
-          <w:sz w:val="23"/>
-          <w:szCs w:val="23"/>
-        </w:rPr>
-        <w:t xml:space="preserve"> </w:t>
-      </w:r>
-      <w:r>
-        <w:rPr>
-          <w:rFonts w:ascii="Garamond" w:eastAsia="Calibri" w:hAnsi="Garamond" w:cs="Big Caslon Medium"/>
-          <w:kern w:val="0"/>
-          <w:sz w:val="23"/>
-          <w:szCs w:val="23"/>
-        </w:rPr>
-        <w:t>Operation Iraqi Freedom</w:t>
+      </w:pPr>
+      <w:r>
+        <w:t>Maintained optimal functionality of an electronic system under stressful and demanding situations, including support of Operation Iraqi Freedom</w:t>
       </w:r>
     </w:p>
     <w:p>
       <w:pPr>
         <w:pStyle w:val="ListParagraph"/>
-        <w:numPr>
-          <w:ilvl w:val="0"/>
-          <w:numId w:val="41"/>
-        </w:numPr>
-        <w:rPr>
-          <w:rFonts w:ascii="Garamond" w:eastAsia="Calibri" w:hAnsi="Garamond" w:cs="Big Caslon Medium"/>
-          <w:kern w:val="0"/>
-          <w:sz w:val="23"/>
-          <w:szCs w:val="23"/>
-        </w:rPr>
-      </w:pPr>
-      <w:r>
-        <w:rPr>
-          <w:rFonts w:ascii="Garamond" w:eastAsia="Calibri" w:hAnsi="Garamond" w:cs="Big Caslon Medium"/>
-          <w:kern w:val="0"/>
-          <w:sz w:val="23"/>
-          <w:szCs w:val="23"/>
-        </w:rPr>
+      </w:pPr>
+      <w:r>
         <w:t>Handled inventories and procurement of items to maintain maximum functionality of 20 individual issue toolboxes</w:t>
       </w:r>
     </w:p>
     <w:p>
       <w:pPr>
         <w:pStyle w:val="ListParagraph"/>
-        <w:numPr>
-          <w:ilvl w:val="0"/>
-          <w:numId w:val="41"/>
-        </w:numPr>
-        <w:rPr>
-          <w:rFonts w:ascii="Garamond" w:eastAsia="Calibri" w:hAnsi="Garamond" w:cs="Big Caslon Medium"/>
-          <w:kern w:val="0"/>
-          <w:sz w:val="23"/>
-          <w:szCs w:val="23"/>
-        </w:rPr>
-      </w:pPr>
-      <w:r>
-        <w:rPr>
-          <w:rFonts w:ascii="Garamond" w:eastAsia="Calibri" w:hAnsi="Garamond" w:cs="Big Caslon Medium"/>
-          <w:kern w:val="0"/>
-          <w:sz w:val="23"/>
-          <w:szCs w:val="23"/>
-        </w:rPr>
-        <w:t>Advised in the general maintenance, emplacement, and movement of 2 mobile radar systems for over 4000 working</w:t>
-      </w:r>
-      <w:r>
-        <w:rPr>
-          <w:rFonts w:ascii="Garamond" w:eastAsia="Calibri" w:hAnsi="Garamond" w:cs="Big Caslon Medium"/>
-          <w:kern w:val="0"/>
-          <w:sz w:val="23"/>
-          <w:szCs w:val="23"/>
-        </w:rPr>
-        <w:t xml:space="preserve"> </w:t>
-      </w:r>
-      <w:r>
-        <w:rPr>
-          <w:rFonts w:ascii="Garamond" w:eastAsia="Calibri" w:hAnsi="Garamond" w:cs="Big Caslon Medium"/>
-          <w:kern w:val="0"/>
-          <w:sz w:val="23"/>
-          <w:szCs w:val="23"/>
-        </w:rPr>
-        <w:t>hours to ensure effectiveness.</w:t>
+      </w:pPr>
+      <w:r>
+        <w:t>Advised in the general maintenance, emplacement, and movement of 2 mobile radar systems for over 4000 working hours to ensure effectiveness.</w:t>
       </w:r>
     </w:p>
     <w:p>
       <w:pPr>
         <w:pStyle w:val="ListParagraph"/>
-        <w:numPr>
-          <w:ilvl w:val="0"/>
-          <w:numId w:val="41"/>
-        </w:numPr>
-        <w:rPr>
-          <w:rFonts w:ascii="Garamond" w:eastAsia="Calibri" w:hAnsi="Garamond" w:cs="Big Caslon Medium"/>
-          <w:kern w:val="0"/>
-          <w:sz w:val="23"/>
-          <w:szCs w:val="23"/>
-        </w:rPr>
-      </w:pPr>
-      <w:r>
-        <w:rPr>
-          <w:rFonts w:ascii="Garamond" w:eastAsia="Calibri" w:hAnsi="Garamond" w:cs="Big Caslon Medium"/>
-          <w:kern w:val="0"/>
-          <w:sz w:val="23"/>
-          <w:szCs w:val="23"/>
-        </w:rPr>
+      </w:pPr>
+      <w:r>
         <w:t>Performed technical maintenance, to component level, on sensitive electronic equipment and subsystems</w:t>
       </w:r>
     </w:p>
     <w:p>
       <w:pPr>
         <w:pStyle w:val="ListParagraph"/>
-        <w:numPr>
-          <w:ilvl w:val="0"/>
-          <w:numId w:val="41"/>
-        </w:numPr>
-        <w:rPr>
-          <w:rFonts w:ascii="Garamond" w:eastAsia="Calibri" w:hAnsi="Garamond" w:cs="Big Caslon Medium"/>
-          <w:kern w:val="0"/>
-          <w:sz w:val="23"/>
-          <w:szCs w:val="23"/>
-        </w:rPr>
-      </w:pPr>
-      <w:r>
-        <w:rPr>
-          <w:rFonts w:ascii="Garamond" w:eastAsia="Calibri" w:hAnsi="Garamond" w:cs="Big Caslon Medium"/>
-          <w:kern w:val="0"/>
-          <w:sz w:val="23"/>
-          <w:szCs w:val="23"/>
-        </w:rPr>
+      </w:pPr>
+      <w:r>
         <w:t>Utilized schematic references to troubleshoot electronic, pneumatic, and mechanical failures</w:t>
       </w:r>
     </w:p>
     <w:p>
       <w:pPr>
         <w:pStyle w:val="ListParagraph"/>
-        <w:numPr>
-          <w:ilvl w:val="0"/>
-          <w:numId w:val="41"/>
-        </w:numPr>
-        <w:rPr>
-          <w:rFonts w:ascii="Garamond" w:eastAsia="Calibri" w:hAnsi="Garamond" w:cs="Big Caslon Medium"/>
-          <w:kern w:val="0"/>
-          <w:sz w:val="23"/>
-          <w:szCs w:val="23"/>
-        </w:rPr>
-      </w:pPr>
-      <w:r>
-        <w:rPr>
-          <w:rFonts w:ascii="Garamond" w:eastAsia="Calibri" w:hAnsi="Garamond" w:cs="Big Caslon Medium"/>
-          <w:kern w:val="0"/>
-          <w:sz w:val="23"/>
-          <w:szCs w:val="23"/>
-        </w:rPr>
+      </w:pPr>
+      <w:r>
         <w:t>Performed extensive record management to track work history and identify key areas of observation for faults</w:t>
       </w:r>
     </w:p>
     <w:p>
-      <w:pPr>
-        <w:rPr>
-          <w:rFonts w:ascii="Garamond" w:eastAsia="Calibri" w:hAnsi="Garamond" w:cs="Big Caslon Medium"/>
-          <w:kern w:val="0"/>
-          <w:sz w:val="23"/>
-          <w:szCs w:val="23"/>
-        </w:rPr>
-      </w:pPr>
-      <w:r>
-        <w:rPr>
-          <w:rFonts w:ascii="Garamond" w:eastAsia="Calibri" w:hAnsi="Garamond" w:cs="Big Caslon Medium"/>
-          <w:b/>
-          <w:bCs/>
-          <w:kern w:val="0"/>
-          <w:sz w:val="23"/>
-          <w:szCs w:val="23"/>
-        </w:rPr>
-        <w:t>Supervisor:</w:t>
-      </w:r>
-      <w:r>
-        <w:rPr>
-          <w:rFonts w:ascii="Garamond" w:eastAsia="Calibri" w:hAnsi="Garamond" w:cs="Big Caslon Medium"/>
-          <w:b/>
-          <w:bCs/>
-          <w:kern w:val="0"/>
-          <w:sz w:val="23"/>
-          <w:szCs w:val="23"/>
-        </w:rPr>
-        <w:t xml:space="preserve"> </w:t>
-      </w:r>
-      <w:r>
-        <w:rPr>
-          <w:rFonts w:ascii="Garamond" w:eastAsia="Calibri" w:hAnsi="Garamond" w:cs="Big Caslon Medium"/>
-          <w:kern w:val="0"/>
-          <w:sz w:val="23"/>
-          <w:szCs w:val="23"/>
-        </w:rPr>
-        <w:t>Sgt. Terry Miller</w:t>
-      </w:r>
-      <w:r>
-        <w:rPr>
-          <w:rFonts w:ascii="Garamond" w:eastAsia="Calibri" w:hAnsi="Garamond" w:cs="Big Caslon Medium"/>
-          <w:kern w:val="0"/>
-          <w:sz w:val="23"/>
-          <w:szCs w:val="23"/>
-        </w:rPr>
-        <w:t xml:space="preserve"> </w:t>
-      </w:r>
-      <w:r>
-        <w:rPr>
-          <w:rFonts w:ascii="Garamond" w:eastAsia="Calibri" w:hAnsi="Garamond" w:cs="Big Caslon Medium"/>
-          <w:kern w:val="0"/>
-          <w:sz w:val="23"/>
-          <w:szCs w:val="23"/>
-        </w:rPr>
-        <w:t>(252) 466-3998</w:t>
-      </w:r>
-    </w:p>
-    <w:p>
-      <w:pPr>
-        <w:rPr>
-          <w:rFonts w:ascii="Garamond" w:eastAsia="Calibri" w:hAnsi="Garamond" w:cs="Big Caslon Medium"/>
-          <w:kern w:val="0"/>
-          <w:sz w:val="23"/>
-          <w:szCs w:val="23"/>
-        </w:rPr>
-      </w:pPr>
-      <w:r>
-        <w:rPr>
-          <w:rFonts w:ascii="Garamond" w:eastAsia="Calibri" w:hAnsi="Garamond" w:cs="Big Caslon Medium"/>
-          <w:b/>
-          <w:bCs/>
-          <w:kern w:val="0"/>
-          <w:sz w:val="23"/>
-          <w:szCs w:val="23"/>
-        </w:rPr>
-        <w:t>Okay to contact this</w:t>
-      </w:r>
-      <w:r>
-        <w:rPr>
-          <w:rFonts w:ascii="Garamond" w:eastAsia="Calibri" w:hAnsi="Garamond" w:cs="Big Caslon Medium"/>
-          <w:b/>
-          <w:bCs/>
-          <w:kern w:val="0"/>
-          <w:sz w:val="23"/>
-          <w:szCs w:val="23"/>
-        </w:rPr>
-        <w:t xml:space="preserve"> </w:t>
-      </w:r>
-      <w:r>
-        <w:rPr>
-          <w:rFonts w:ascii="Garamond" w:eastAsia="Calibri" w:hAnsi="Garamond" w:cs="Big Caslon Medium"/>
-          <w:b/>
-          <w:bCs/>
-          <w:kern w:val="0"/>
-          <w:sz w:val="23"/>
-          <w:szCs w:val="23"/>
-        </w:rPr>
-        <w:t>Supervisor:</w:t>
-      </w:r>
-      <w:r>
-        <w:rPr>
-          <w:rFonts w:ascii="Garamond" w:eastAsia="Calibri" w:hAnsi="Garamond" w:cs="Big Caslon Medium"/>
-          <w:kern w:val="0"/>
-          <w:sz w:val="23"/>
-          <w:szCs w:val="23"/>
-        </w:rPr>
-        <w:t xml:space="preserve"> </w:t>
-      </w:r>
-      <w:r>
-        <w:rPr>
-          <w:rFonts w:ascii="Garamond" w:eastAsia="Calibri" w:hAnsi="Garamond" w:cs="Big Caslon Medium"/>
-          <w:kern w:val="0"/>
-          <w:sz w:val="23"/>
-          <w:szCs w:val="23"/>
-        </w:rPr>
-        <w:t>Yes</w:t>
-      </w:r>
-    </w:p>
-    <w:p>
-      <w:pPr>
-        <w:rPr>
-          <w:rFonts w:ascii="Garamond" w:eastAsia="Calibri" w:hAnsi="Garamond" w:cs="Big Caslon Medium"/>
-          <w:kern w:val="0"/>
-          <w:sz w:val="23"/>
-          <w:szCs w:val="23"/>
-        </w:rPr>
-      </w:pPr>
-    </w:p>
-    <w:p>
-      <w:pPr>
-        <w:pBdr>
-          <w:bottom w:val="single" w:sz="4" w:space="1" w:color="auto"/>
-        </w:pBdr>
-        <w:jc w:val="center"/>
-        <w:rPr>
-          <w:rFonts w:ascii="Garamond" w:hAnsi="Garamond" w:cs="Big Caslon Medium"/>
-          <w:b/>
-          <w:sz w:val="23"/>
-          <w:szCs w:val="23"/>
-        </w:rPr>
-      </w:pPr>
-      <w:r>
-        <w:rPr>
-          <w:rFonts w:ascii="Garamond" w:hAnsi="Garamond" w:cs="Big Caslon Medium"/>
-          <w:b/>
-          <w:sz w:val="23"/>
-          <w:szCs w:val="23"/>
-        </w:rPr>
-        <w:t>R</w:t>
-      </w:r>
-      <w:r>
-        <w:rPr>
-          <w:rFonts w:ascii="Garamond" w:hAnsi="Garamond" w:cs="Big Caslon Medium"/>
-          <w:b/>
-          <w:sz w:val="23"/>
-          <w:szCs w:val="23"/>
-        </w:rPr>
-        <w:t>EFERENCES</w:t>
-      </w:r>
-      <w:r>
-        <w:rPr>
-          <w:rFonts w:ascii="Garamond" w:hAnsi="Garamond" w:cs="Big Caslon Medium"/>
-          <w:b/>
-          <w:sz w:val="23"/>
-          <w:szCs w:val="23"/>
-        </w:rPr>
-        <w:t>:</w:t>
-      </w:r>
-    </w:p>
-    <w:p>
-      <w:pPr>
-        <w:jc w:val="center"/>
-        <w:rPr>
-          <w:rFonts w:ascii="Garamond" w:hAnsi="Garamond" w:cs="Big Caslon Medium"/>
-          <w:b/>
-          <w:sz w:val="23"/>
-          <w:szCs w:val="23"/>
-        </w:rPr>
-        <w:sectPr>
-          <w:type w:val="continuous"/>
-          <w:pgSz w:w="12240" w:h="15840"/>
-          <w:pgMar w:top="720" w:right="720" w:bottom="288" w:left="720" w:header="720" w:footer="720" w:gutter="0"/>
-          <w:cols w:space="720"/>
-          <w:titlePg/>
-          <w:docGrid w:linePitch="360"/>
-        </w:sectPr>
-      </w:pPr>
-    </w:p>
-    <w:p>
-      <w:pPr>
-        <w:jc w:val="center"/>
-        <w:rPr>
-          <w:rFonts w:ascii="Garamond" w:hAnsi="Garamond" w:cs="Big Caslon Medium"/>
-          <w:b/>
-          <w:sz w:val="23"/>
-          <w:szCs w:val="23"/>
-        </w:rPr>
-      </w:pPr>
-      <w:r>
-        <w:rPr>
-          <w:rFonts w:ascii="Garamond" w:hAnsi="Garamond" w:cs="Big Caslon Medium"/>
-          <w:b/>
-          <w:sz w:val="23"/>
-          <w:szCs w:val="23"/>
-        </w:rPr>
+      <w:pPr/>
+      <w:r>
+        <w:t>Supervisor: Sgt. Terry Miller (252) 466-3998</w:t>
+      </w:r>
+    </w:p>
+    <w:p>
+      <w:pPr/>
+      <w:r>
+        <w:t>Okay to contact this Supervisor: Yes</w:t>
+      </w:r>
+    </w:p>
+    <w:p>
+      <w:pPr/>
+    </w:p>
+    <w:p>
+      <w:pPr/>
+      <w:r>
+        <w:t>REFERENCES:</w:t>
+      </w:r>
+    </w:p>
+    <w:p>
+      <w:pPr/>
+    </w:p>
+    <w:p>
+      <w:pPr/>
+      <w:r>
         <w:t>Name</w:t>
       </w:r>
     </w:p>
     <w:p>
-      <w:pPr>
-        <w:rPr>
-          <w:rFonts w:ascii="Garamond" w:hAnsi="Garamond" w:cs="Big Caslon Medium"/>
-          <w:bCs/>
-          <w:sz w:val="23"/>
-          <w:szCs w:val="23"/>
-        </w:rPr>
-      </w:pPr>
-      <w:r>
-        <w:rPr>
-          <w:rFonts w:ascii="Garamond" w:hAnsi="Garamond" w:cs="Big Caslon Medium"/>
-          <w:bCs/>
-          <w:sz w:val="23"/>
-          <w:szCs w:val="23"/>
-        </w:rPr>
+      <w:pPr/>
+      <w:r>
         <w:t>Vicki Ware</w:t>
       </w:r>
     </w:p>
     <w:p>
-      <w:pPr>
-        <w:rPr>
-          <w:rFonts w:ascii="Garamond" w:hAnsi="Garamond" w:cs="Big Caslon Medium"/>
-          <w:bCs/>
-          <w:sz w:val="23"/>
-          <w:szCs w:val="23"/>
-        </w:rPr>
-      </w:pPr>
-      <w:r>
-        <w:rPr>
-          <w:rFonts w:ascii="Garamond" w:hAnsi="Garamond" w:cs="Big Caslon Medium"/>
-          <w:bCs/>
-          <w:sz w:val="23"/>
-          <w:szCs w:val="23"/>
-        </w:rPr>
+      <w:pPr/>
+      <w:r>
         <w:t>Aaron Loss</w:t>
       </w:r>
     </w:p>
     <w:p>
-      <w:pPr>
-        <w:rPr>
-          <w:rFonts w:ascii="Garamond" w:hAnsi="Garamond" w:cs="Big Caslon Medium"/>
-          <w:b/>
-          <w:sz w:val="23"/>
-          <w:szCs w:val="23"/>
-        </w:rPr>
-      </w:pPr>
-      <w:r>
-        <w:rPr>
-          <w:rFonts w:ascii="Garamond" w:hAnsi="Garamond" w:cs="Big Caslon Medium"/>
-          <w:bCs/>
-          <w:sz w:val="23"/>
-          <w:szCs w:val="23"/>
-        </w:rPr>
+      <w:pPr/>
+      <w:r>
         <w:t>Russell Jackson</w:t>
       </w:r>
     </w:p>
     <w:p>
-      <w:pPr>
-        <w:ind w:left="-360"/>
-        <w:jc w:val="center"/>
-        <w:rPr>
-          <w:rFonts w:ascii="Garamond" w:hAnsi="Garamond" w:cs="Big Caslon Medium"/>
-          <w:b/>
-          <w:sz w:val="23"/>
-          <w:szCs w:val="23"/>
-        </w:rPr>
-      </w:pPr>
-      <w:r>
-        <w:rPr>
-          <w:rFonts w:ascii="Garamond" w:hAnsi="Garamond" w:cs="Big Caslon Medium"/>
-          <w:b/>
-          <w:sz w:val="23"/>
-          <w:szCs w:val="23"/>
-        </w:rPr>
+      <w:pPr/>
+      <w:r>
         <w:t>Employer</w:t>
       </w:r>
     </w:p>
     <w:p>
-      <w:pPr>
-        <w:ind w:left="360"/>
-        <w:rPr>
-          <w:rFonts w:ascii="Garamond" w:hAnsi="Garamond" w:cs="Big Caslon Medium"/>
-          <w:bCs/>
-          <w:sz w:val="23"/>
-          <w:szCs w:val="23"/>
-        </w:rPr>
-      </w:pPr>
-      <w:r>
-        <w:rPr>
-          <w:rFonts w:ascii="Garamond" w:hAnsi="Garamond" w:cs="Big Caslon Medium"/>
-          <w:bCs/>
-          <w:sz w:val="23"/>
-          <w:szCs w:val="23"/>
-        </w:rPr>
+      <w:pPr/>
+      <w:r>
         <w:t>DLA</w:t>
       </w:r>
     </w:p>
     <w:p>
-      <w:pPr>
-        <w:rPr>
-          <w:rFonts w:ascii="Garamond" w:hAnsi="Garamond" w:cs="Big Caslon Medium"/>
-          <w:b/>
-          <w:sz w:val="23"/>
-          <w:szCs w:val="23"/>
-        </w:rPr>
-      </w:pPr>
-    </w:p>
-    <w:p>
-      <w:pPr>
-        <w:rPr>
-          <w:rFonts w:ascii="Garamond" w:hAnsi="Garamond" w:cs="Big Caslon Medium"/>
-          <w:b/>
-          <w:sz w:val="23"/>
-          <w:szCs w:val="23"/>
-        </w:rPr>
-      </w:pPr>
-    </w:p>
-    <w:p>
-      <w:pPr>
-        <w:ind w:left="-360"/>
-        <w:jc w:val="center"/>
-        <w:rPr>
-          <w:rFonts w:ascii="Garamond" w:hAnsi="Garamond" w:cs="Big Caslon Medium"/>
-          <w:b/>
-          <w:sz w:val="23"/>
-          <w:szCs w:val="23"/>
-        </w:rPr>
-      </w:pPr>
-      <w:r>
-        <w:rPr>
-          <w:rFonts w:ascii="Garamond" w:hAnsi="Garamond" w:cs="Big Caslon Medium"/>
-          <w:b/>
-          <w:sz w:val="23"/>
-          <w:szCs w:val="23"/>
-        </w:rPr>
+      <w:pPr/>
+    </w:p>
+    <w:p>
+      <w:pPr/>
+      <w:r>
         <w:t>Title</w:t>
       </w:r>
     </w:p>
     <w:p>
-      <w:pPr>
-        <w:ind w:left="-360"/>
-        <w:jc w:val="center"/>
-        <w:rPr>
-          <w:rFonts w:ascii="Garamond" w:hAnsi="Garamond" w:cs="Big Caslon Medium"/>
-          <w:bCs/>
-          <w:sz w:val="23"/>
-          <w:szCs w:val="23"/>
-        </w:rPr>
-      </w:pPr>
-      <w:r>
-        <w:rPr>
-          <w:rFonts w:ascii="Garamond" w:hAnsi="Garamond" w:cs="Big Caslon Medium"/>
-          <w:bCs/>
-          <w:sz w:val="23"/>
-          <w:szCs w:val="23"/>
-        </w:rPr>
+      <w:pPr/>
+      <w:r>
         <w:t>IT Specialist</w:t>
       </w:r>
     </w:p>
     <w:p>
-      <w:pPr>
-        <w:ind w:left="-360"/>
-        <w:rPr>
-          <w:rFonts w:ascii="Garamond" w:hAnsi="Garamond" w:cs="Big Caslon Medium"/>
-          <w:b/>
-          <w:sz w:val="23"/>
-          <w:szCs w:val="23"/>
-        </w:rPr>
-      </w:pPr>
-    </w:p>
-    <w:p>
-      <w:pPr>
-        <w:rPr>
-          <w:rFonts w:ascii="Garamond" w:hAnsi="Garamond" w:cs="Big Caslon Medium"/>
-          <w:b/>
-          <w:sz w:val="23"/>
-          <w:szCs w:val="23"/>
-        </w:rPr>
-      </w:pPr>
-    </w:p>
-    <w:p>
-      <w:pPr>
-        <w:ind w:left="-360"/>
-        <w:jc w:val="center"/>
-        <w:rPr>
-          <w:rFonts w:ascii="Garamond" w:hAnsi="Garamond" w:cs="Big Caslon Medium"/>
-          <w:b/>
-          <w:sz w:val="23"/>
-          <w:szCs w:val="23"/>
-        </w:rPr>
-      </w:pPr>
-      <w:r>
-        <w:rPr>
-          <w:rFonts w:ascii="Garamond" w:hAnsi="Garamond" w:cs="Big Caslon Medium"/>
-          <w:b/>
-          <w:sz w:val="23"/>
-          <w:szCs w:val="23"/>
-        </w:rPr>
+      <w:pPr/>
+    </w:p>
+    <w:p>
+      <w:pPr/>
+      <w:r>
         <w:t>Phone</w:t>
       </w:r>
     </w:p>
     <w:p>
-      <w:pPr>
-        <w:ind w:left="-360"/>
-        <w:jc w:val="center"/>
-        <w:rPr>
-          <w:rFonts w:ascii="Garamond" w:hAnsi="Garamond" w:cs="Big Caslon Medium"/>
-          <w:bCs/>
-          <w:sz w:val="23"/>
-          <w:szCs w:val="23"/>
-        </w:rPr>
-      </w:pPr>
-      <w:r>
-        <w:rPr>
-          <w:rFonts w:ascii="Garamond" w:hAnsi="Garamond" w:cs="Big Caslon Medium"/>
-          <w:bCs/>
-          <w:sz w:val="23"/>
-          <w:szCs w:val="23"/>
-        </w:rPr>
-        <w:t>757</w:t>
-      </w:r>
-      <w:r>
-        <w:rPr>
-          <w:rFonts w:ascii="Garamond" w:hAnsi="Garamond" w:cs="Big Caslon Medium"/>
-          <w:bCs/>
-          <w:sz w:val="23"/>
-          <w:szCs w:val="23"/>
-        </w:rPr>
-        <w:t>-</w:t>
-      </w:r>
-      <w:r>
-        <w:rPr>
-          <w:rFonts w:ascii="Garamond" w:hAnsi="Garamond" w:cs="Big Caslon Medium"/>
-          <w:bCs/>
-          <w:sz w:val="23"/>
-          <w:szCs w:val="23"/>
-        </w:rPr>
-        <w:t>239</w:t>
-      </w:r>
-      <w:r>
-        <w:rPr>
-          <w:rFonts w:ascii="Garamond" w:hAnsi="Garamond" w:cs="Big Caslon Medium"/>
-          <w:bCs/>
-          <w:sz w:val="23"/>
-          <w:szCs w:val="23"/>
-        </w:rPr>
-        <w:t>-</w:t>
-      </w:r>
-      <w:r>
-        <w:rPr>
-          <w:rFonts w:ascii="Garamond" w:hAnsi="Garamond" w:cs="Big Caslon Medium"/>
-          <w:bCs/>
-          <w:sz w:val="23"/>
-          <w:szCs w:val="23"/>
-        </w:rPr>
-        <w:t>8544</w:t>
-      </w:r>
-    </w:p>
-    <w:p>
-      <w:pPr>
-        <w:ind w:left="-360"/>
-        <w:jc w:val="center"/>
-        <w:rPr>
-          <w:rFonts w:ascii="Garamond" w:hAnsi="Garamond" w:cs="Big Caslon Medium"/>
-          <w:bCs/>
-          <w:sz w:val="23"/>
-          <w:szCs w:val="23"/>
-        </w:rPr>
-      </w:pPr>
-      <w:r>
-        <w:rPr>
-          <w:rFonts w:ascii="Garamond" w:hAnsi="Garamond" w:cs="Big Caslon Medium"/>
-          <w:bCs/>
-          <w:sz w:val="23"/>
-          <w:szCs w:val="23"/>
-        </w:rPr>
+      <w:pPr/>
+      <w:r>
+        <w:t>757-239-8544</w:t>
+      </w:r>
+    </w:p>
+    <w:p>
+      <w:pPr/>
+      <w:r>
         <w:t>757-879-6701</w:t>
       </w:r>
     </w:p>
     <w:p>
-      <w:pPr>
-        <w:ind w:left="-360"/>
-        <w:jc w:val="center"/>
-        <w:rPr>
-          <w:rFonts w:ascii="Garamond" w:hAnsi="Garamond" w:cs="Big Caslon Medium"/>
-          <w:bCs/>
-          <w:sz w:val="23"/>
-          <w:szCs w:val="23"/>
-        </w:rPr>
-      </w:pPr>
-      <w:r>
-        <w:rPr>
-          <w:rFonts w:ascii="Garamond" w:hAnsi="Garamond" w:cs="Big Caslon Medium"/>
-          <w:bCs/>
-          <w:sz w:val="23"/>
-          <w:szCs w:val="23"/>
-        </w:rPr>
+      <w:pPr/>
+      <w:r>
         <w:t>443-253-9308</w:t>
       </w:r>
     </w:p>
     <w:p>
-      <w:pPr>
-        <w:ind w:left="-360"/>
-        <w:jc w:val="center"/>
-        <w:rPr>
-          <w:rFonts w:ascii="Garamond" w:hAnsi="Garamond" w:cs="Big Caslon Medium"/>
-          <w:b/>
-          <w:sz w:val="23"/>
-          <w:szCs w:val="23"/>
-        </w:rPr>
-      </w:pPr>
-      <w:r>
-        <w:rPr>
-          <w:rFonts w:ascii="Garamond" w:hAnsi="Garamond" w:cs="Big Caslon Medium"/>
-          <w:b/>
-          <w:sz w:val="23"/>
-          <w:szCs w:val="23"/>
-        </w:rPr>
+      <w:pPr/>
+      <w:r>
         <w:t>Email</w:t>
       </w:r>
     </w:p>
     <w:p>
-      <w:pPr>
-        <w:ind w:left="-360"/>
-        <w:jc w:val="center"/>
-        <w:rPr>
-          <w:rFonts w:ascii="Garamond" w:hAnsi="Garamond" w:cs="Big Caslon Medium"/>
-          <w:bCs/>
-          <w:sz w:val="22"/>
-          <w:szCs w:val="22"/>
-        </w:rPr>
-      </w:pPr>
-      <w:r>
-        <w:rPr>
-          <w:rFonts w:ascii="Garamond" w:hAnsi="Garamond" w:cs="Big Caslon Medium"/>
-          <w:bCs/>
-          <w:sz w:val="22"/>
-          <w:szCs w:val="22"/>
-        </w:rPr>
-        <w:t>vicki.ware@gmail.co</w:t>
-      </w:r>
-      <w:r>
-        <w:rPr>
-          <w:rFonts w:ascii="Garamond" w:hAnsi="Garamond" w:cs="Big Caslon Medium"/>
-          <w:bCs/>
-          <w:sz w:val="22"/>
-          <w:szCs w:val="22"/>
-        </w:rPr>
-        <w:t>m</w:t>
-      </w:r>
-    </w:p>
-    <w:p>
-      <w:pPr>
-        <w:jc w:val="center"/>
-        <w:rPr>
-          <w:rFonts w:ascii="Garamond" w:hAnsi="Garamond" w:cs="Big Caslon Medium"/>
-          <w:b/>
-          <w:sz w:val="23"/>
-          <w:szCs w:val="23"/>
-        </w:rPr>
-        <w:sectPr>
-          <w:type w:val="continuous"/>
-          <w:pgSz w:w="12240" w:h="15840"/>
-          <w:pgMar w:top="720" w:right="720" w:bottom="288" w:left="720" w:header="720" w:footer="720" w:gutter="0"/>
-          <w:cols w:num="5" w:space="720"/>
-          <w:titlePg/>
-          <w:docGrid w:linePitch="360"/>
-        </w:sectPr>
-      </w:pPr>
-    </w:p>
-    <w:p>
-      <w:pPr>
-        <w:jc w:val="center"/>
-        <w:rPr>
-          <w:rFonts w:ascii="Garamond" w:hAnsi="Garamond" w:cs="Big Caslon Medium"/>
-          <w:b/>
-          <w:sz w:val="23"/>
-          <w:szCs w:val="23"/>
-        </w:rPr>
-      </w:pPr>
-    </w:p>
-    <w:p>
-      <w:pPr>
-        <w:jc w:val="center"/>
-        <w:rPr>
-          <w:rFonts w:ascii="Garamond" w:hAnsi="Garamond" w:cs="Big Caslon Medium"/>
-          <w:b/>
-          <w:sz w:val="23"/>
-          <w:szCs w:val="23"/>
-        </w:rPr>
-      </w:pPr>
-    </w:p>
-    <w:p>
-      <w:pPr>
-        <w:jc w:val="center"/>
-        <w:rPr>
-          <w:rFonts w:ascii="Garamond" w:hAnsi="Garamond" w:cs="Big Caslon Medium"/>
-          <w:b/>
-          <w:sz w:val="23"/>
-          <w:szCs w:val="23"/>
-        </w:rPr>
-      </w:pPr>
-    </w:p>
-    <w:p>
-      <w:pPr>
-        <w:jc w:val="center"/>
-        <w:rPr>
-          <w:rFonts w:ascii="Garamond" w:hAnsi="Garamond" w:cs="Big Caslon Medium"/>
-          <w:b/>
-          <w:sz w:val="23"/>
-          <w:szCs w:val="23"/>
-        </w:rPr>
-      </w:pPr>
-    </w:p>
-    <w:p>
-      <w:pPr>
-        <w:jc w:val="center"/>
-        <w:rPr>
-          <w:rFonts w:ascii="Garamond" w:hAnsi="Garamond" w:cs="Big Caslon Medium"/>
-          <w:b/>
-          <w:sz w:val="23"/>
-          <w:szCs w:val="23"/>
-        </w:rPr>
-      </w:pPr>
-    </w:p>
-    <w:p>
-      <w:pPr>
-        <w:jc w:val="center"/>
-        <w:rPr>
-          <w:rFonts w:ascii="Garamond" w:hAnsi="Garamond" w:cs="Big Caslon Medium"/>
-          <w:b/>
-          <w:sz w:val="23"/>
-          <w:szCs w:val="23"/>
-        </w:rPr>
-      </w:pPr>
-    </w:p>
-    <w:p>
-      <w:pPr>
-        <w:rPr>
-          <w:rFonts w:ascii="Garamond" w:hAnsi="Garamond" w:cs="Big Caslon Medium"/>
-          <w:b/>
-          <w:sz w:val="23"/>
-          <w:szCs w:val="23"/>
-        </w:rPr>
-      </w:pPr>
+      <w:pPr/>
+      <w:r>
+        <w:t>vicki.ware@gmail.com</w:t>
+      </w:r>
     </w:p>
     <w:sectPr>
       <w:type w:val="continuous"/>

</xml_diff>

<commit_message>
Add targeted streaming and programmer resumes with stronger metrics.
Fold keyword chips into competencies, quantify VIP/MTTM/player tooling impact, and link PDF/DOCX downloads for both resume tracks.

Co-authored-by: Cursor <cursoragent@cursor.com>
</commit_message>
<xml_diff>
--- a/resources/Aaron_Berman Federal Resume v1.docx
+++ b/resources/Aaron_Berman Federal Resume v1.docx
@@ -155,7 +155,7 @@
           <w:sz w:val="23"/>
           <w:szCs w:val="23"/>
         </w:rPr>
-        <w:t>Streaming Support Engineer | Computer Scientist | Systems Administrator | Security Specialist</w:t>
+        <w:t>Streaming Support Engineer | Programmer Analyst | Computer Scientist | Systems Support</w:t>
       </w:r>
       <w:r>
         <w:rPr>
@@ -233,7 +233,7 @@
           <w:sz w:val="23"/>
           <w:szCs w:val="23"/>
         </w:rPr>
-        <w:t>Computer Scientist</w:t>
+        <w:t>Streaming Support Engineer and Computer Scientist supporting live/VOD streaming platforms, incident response, observability tooling, and production troubleshooting. Experience includes Programmer Analyst work on DoD Joint Knowledge Online (JKO) courseware using HTML, CSS, JavaScript, and TypeScript. Skills: Python, Bash, regex, Splunk, Grafana, Observe, Jira/JSM, Confluence, AWS SSM, Docker, Git, Linux, Unix, macOS, Apache, MySQL. B.S. Computer Science, Cybersecurity minor, Cum Laude (GPA 3.58). U.S. Marine Corps veteran (Aviation Radar Repair).</w:t>
       </w:r>
       <w:r>
         <w:rPr>
@@ -244,7 +244,6 @@
           <w:sz w:val="23"/>
           <w:szCs w:val="23"/>
         </w:rPr>
-        <w:t xml:space="preserve"> and Military Veteran leveraging knowledge and experience ensuring appropriate </w:t>
       </w:r>
       <w:r>
         <w:rPr>
@@ -255,7 +254,6 @@
           <w:sz w:val="23"/>
           <w:szCs w:val="23"/>
         </w:rPr>
-        <w:t xml:space="preserve">software design principles </w:t>
       </w:r>
       <w:r>
         <w:rPr>
@@ -266,7 +264,6 @@
           <w:sz w:val="23"/>
           <w:szCs w:val="23"/>
         </w:rPr>
-        <w:t xml:space="preserve">and </w:t>
       </w:r>
       <w:r>
         <w:rPr>
@@ -277,7 +274,6 @@
           <w:sz w:val="23"/>
           <w:szCs w:val="23"/>
         </w:rPr>
-        <w:t xml:space="preserve">security controls are in place that will </w:t>
       </w:r>
       <w:r>
         <w:rPr>
@@ -288,7 +284,6 @@
           <w:sz w:val="23"/>
           <w:szCs w:val="23"/>
         </w:rPr>
-        <w:t>ensure maintainability and robustness of software</w:t>
       </w:r>
       <w:r>
         <w:rPr>
@@ -299,7 +294,6 @@
           <w:sz w:val="23"/>
           <w:szCs w:val="23"/>
         </w:rPr>
-        <w:t xml:space="preserve"> while</w:t>
       </w:r>
       <w:r>
         <w:rPr>
@@ -310,7 +304,6 @@
           <w:sz w:val="23"/>
           <w:szCs w:val="23"/>
         </w:rPr>
-        <w:t xml:space="preserve"> </w:t>
       </w:r>
       <w:r>
         <w:rPr>
@@ -321,7 +314,6 @@
           <w:sz w:val="23"/>
           <w:szCs w:val="23"/>
         </w:rPr>
-        <w:t>safeguard</w:t>
       </w:r>
       <w:r>
         <w:rPr>
@@ -332,7 +324,6 @@
           <w:sz w:val="23"/>
           <w:szCs w:val="23"/>
         </w:rPr>
-        <w:t>ing</w:t>
       </w:r>
       <w:r>
         <w:rPr>
@@ -343,7 +334,6 @@
           <w:sz w:val="23"/>
           <w:szCs w:val="23"/>
         </w:rPr>
-        <w:t xml:space="preserve"> digital </w:t>
       </w:r>
       <w:r>
         <w:rPr>
@@ -354,7 +344,6 @@
           <w:sz w:val="23"/>
           <w:szCs w:val="23"/>
         </w:rPr>
-        <w:t>assets</w:t>
       </w:r>
       <w:r>
         <w:rPr>
@@ -365,7 +354,6 @@
           <w:sz w:val="23"/>
           <w:szCs w:val="23"/>
         </w:rPr>
-        <w:t xml:space="preserve"> and vital electronic infrastructure. </w:t>
       </w:r>
       <w:r>
         <w:rPr>
@@ -376,7 +364,6 @@
           <w:sz w:val="23"/>
           <w:szCs w:val="23"/>
         </w:rPr>
-        <w:t>Adept</w:t>
       </w:r>
       <w:r>
         <w:rPr>
@@ -384,7 +371,6 @@
           <w:sz w:val="23"/>
           <w:szCs w:val="23"/>
         </w:rPr>
-        <w:t xml:space="preserve"> at </w:t>
       </w:r>
       <w:r>
         <w:rPr>
@@ -395,7 +381,6 @@
           <w:sz w:val="23"/>
           <w:szCs w:val="23"/>
         </w:rPr>
-        <w:t>diagnosing and resolving system hardware, software, connectivity, and security issues with a</w:t>
       </w:r>
       <w:r>
         <w:rPr>
@@ -406,7 +391,6 @@
           <w:sz w:val="23"/>
           <w:szCs w:val="23"/>
         </w:rPr>
-        <w:t>n</w:t>
       </w:r>
       <w:r>
         <w:rPr>
@@ -417,7 +401,6 @@
           <w:sz w:val="23"/>
           <w:szCs w:val="23"/>
         </w:rPr>
-        <w:t xml:space="preserve"> understanding of disaster recovery to implement backup procedures and techniques.</w:t>
       </w:r>
       <w:r>
         <w:rPr>
@@ -428,7 +411,6 @@
           <w:sz w:val="23"/>
           <w:szCs w:val="23"/>
         </w:rPr>
-        <w:t xml:space="preserve"> Hands-on experience researching, developing</w:t>
       </w:r>
       <w:r>
         <w:rPr>
@@ -439,7 +421,6 @@
           <w:sz w:val="23"/>
           <w:szCs w:val="23"/>
         </w:rPr>
-        <w:t>,</w:t>
       </w:r>
       <w:r>
         <w:rPr>
@@ -450,7 +431,6 @@
           <w:sz w:val="23"/>
           <w:szCs w:val="23"/>
         </w:rPr>
-        <w:t xml:space="preserve"> and implementing testing methods and procedures. Possess a comprehensive background in data security, continuous integration, and organizational strategy. Career supported by a Bachelor of Science in Computer Science with a concentration in Cyber Security.</w:t>
       </w:r>
     </w:p>
     <w:p>
@@ -468,349 +448,6 @@
           <w:pgSz w:w="12240" w:h="15840"/>
           <w:pgMar w:top="720" w:right="720" w:bottom="288" w:left="720" w:header="720" w:footer="720" w:gutter="0"/>
           <w:cols w:space="720"/>
-          <w:docGrid w:linePitch="360"/>
-        </w:sectPr>
-      </w:pPr>
-    </w:p>
-    <w:p>
-      <w:pPr>
-        <w:pStyle w:val="ListParagraph"/>
-        <w:numPr>
-          <w:ilvl w:val="0"/>
-          <w:numId w:val="6"/>
-        </w:numPr>
-        <w:autoSpaceDE w:val="0"/>
-        <w:autoSpaceDN w:val="0"/>
-        <w:ind w:left="810" w:right="-840"/>
-        <w:jc w:val="both"/>
-        <w:rPr>
-          <w:rFonts w:ascii="Garamond" w:hAnsi="Garamond" w:cs="Big Caslon Medium"/>
-          <w:sz w:val="23"/>
-          <w:szCs w:val="23"/>
-        </w:rPr>
-      </w:pPr>
-      <w:r>
-        <w:rPr>
-          <w:rFonts w:ascii="Garamond" w:hAnsi="Garamond" w:cs="Big Caslon Medium"/>
-          <w:sz w:val="23"/>
-          <w:szCs w:val="23"/>
-        </w:rPr>
-        <w:t>Software | Tools: Git, Docker, Docker Compose, MySQL, Apache, Bootstrap, Grafana, Splunk, Observe, Jira, Jira Service Management (JSM), Confluence, Slack, Microsoft Teams, AWS Systems Manager (SSM), Kiro (AI), Office 365, SharePoint, course authoring tools</w:t>
-      </w:r>
-    </w:p>
-    <w:p>
-      <w:pPr>
-        <w:pStyle w:val="ListParagraph"/>
-        <w:numPr>
-          <w:ilvl w:val="0"/>
-          <w:numId w:val="6"/>
-        </w:numPr>
-        <w:autoSpaceDE w:val="0"/>
-        <w:autoSpaceDN w:val="0"/>
-        <w:ind w:left="810" w:right="-840"/>
-        <w:jc w:val="both"/>
-        <w:rPr>
-          <w:rFonts w:ascii="Garamond" w:hAnsi="Garamond" w:cs="Big Caslon Medium"/>
-          <w:sz w:val="23"/>
-          <w:szCs w:val="23"/>
-        </w:rPr>
-      </w:pPr>
-      <w:r>
-        <w:rPr>
-          <w:rFonts w:ascii="Garamond" w:hAnsi="Garamond" w:cs="Big Caslon Medium"/>
-          <w:sz w:val="23"/>
-          <w:szCs w:val="23"/>
-        </w:rPr>
-        <w:t>Information Assurance</w:t>
-      </w:r>
-    </w:p>
-    <w:p>
-      <w:pPr>
-        <w:pStyle w:val="ListParagraph"/>
-        <w:numPr>
-          <w:ilvl w:val="0"/>
-          <w:numId w:val="6"/>
-        </w:numPr>
-        <w:autoSpaceDE w:val="0"/>
-        <w:autoSpaceDN w:val="0"/>
-        <w:ind w:left="810" w:right="-840"/>
-        <w:jc w:val="both"/>
-        <w:rPr>
-          <w:rFonts w:ascii="Garamond" w:hAnsi="Garamond" w:cs="Big Caslon Medium"/>
-          <w:sz w:val="23"/>
-          <w:szCs w:val="23"/>
-        </w:rPr>
-      </w:pPr>
-      <w:r>
-        <w:rPr>
-          <w:rFonts w:ascii="Garamond" w:hAnsi="Garamond" w:cs="Big Caslon Medium"/>
-          <w:sz w:val="23"/>
-          <w:szCs w:val="23"/>
-        </w:rPr>
-        <w:t>Threats | Vulnerabilities</w:t>
-      </w:r>
-    </w:p>
-    <w:p>
-      <w:pPr>
-        <w:pStyle w:val="ListParagraph"/>
-        <w:autoSpaceDE w:val="0"/>
-        <w:autoSpaceDN w:val="0"/>
-        <w:jc w:val="both"/>
-        <w:rPr>
-          <w:rFonts w:ascii="Garamond" w:hAnsi="Garamond" w:cs="Big Caslon Medium"/>
-          <w:sz w:val="23"/>
-          <w:szCs w:val="23"/>
-        </w:rPr>
-      </w:pPr>
-    </w:p>
-    <w:p>
-      <w:pPr>
-        <w:pStyle w:val="ListParagraph"/>
-        <w:numPr>
-          <w:ilvl w:val="0"/>
-          <w:numId w:val="6"/>
-        </w:numPr>
-        <w:autoSpaceDE w:val="0"/>
-        <w:autoSpaceDN w:val="0"/>
-        <w:ind w:left="360" w:right="-210"/>
-        <w:jc w:val="both"/>
-        <w:rPr>
-          <w:rFonts w:ascii="Garamond" w:hAnsi="Garamond" w:cs="Big Caslon Medium"/>
-          <w:sz w:val="23"/>
-          <w:szCs w:val="23"/>
-        </w:rPr>
-      </w:pPr>
-      <w:r>
-        <w:rPr>
-          <w:rFonts w:ascii="Garamond" w:hAnsi="Garamond" w:cs="Big Caslon Medium"/>
-          <w:sz w:val="23"/>
-          <w:szCs w:val="23"/>
-        </w:rPr>
-        <w:t>Programming Methodol</w:t>
-      </w:r>
-      <w:r>
-        <w:rPr>
-          <w:rFonts w:ascii="Garamond" w:hAnsi="Garamond" w:cs="Big Caslon Medium"/>
-          <w:sz w:val="23"/>
-          <w:szCs w:val="23"/>
-        </w:rPr>
-        <w:t>o</w:t>
-      </w:r>
-      <w:r>
-        <w:rPr>
-          <w:rFonts w:ascii="Garamond" w:hAnsi="Garamond" w:cs="Big Caslon Medium"/>
-          <w:sz w:val="23"/>
-          <w:szCs w:val="23"/>
-        </w:rPr>
-        <w:t>gies</w:t>
-      </w:r>
-    </w:p>
-    <w:p>
-      <w:pPr>
-        <w:pStyle w:val="ListParagraph"/>
-        <w:numPr>
-          <w:ilvl w:val="0"/>
-          <w:numId w:val="6"/>
-        </w:numPr>
-        <w:autoSpaceDE w:val="0"/>
-        <w:autoSpaceDN w:val="0"/>
-        <w:ind w:left="360" w:right="-120"/>
-        <w:jc w:val="both"/>
-        <w:rPr>
-          <w:rFonts w:ascii="Garamond" w:hAnsi="Garamond" w:cs="Big Caslon Medium"/>
-          <w:sz w:val="23"/>
-          <w:szCs w:val="23"/>
-        </w:rPr>
-      </w:pPr>
-      <w:r>
-        <w:rPr>
-          <w:rFonts w:ascii="Garamond" w:hAnsi="Garamond" w:cs="Big Caslon Medium"/>
-          <w:sz w:val="23"/>
-          <w:szCs w:val="23"/>
-        </w:rPr>
-        <w:t>Risk Management</w:t>
-      </w:r>
-      <w:r>
-        <w:rPr>
-          <w:rFonts w:ascii="Garamond" w:hAnsi="Garamond" w:cs="Big Caslon Medium"/>
-          <w:sz w:val="23"/>
-          <w:szCs w:val="23"/>
-        </w:rPr>
-        <w:t xml:space="preserve"> </w:t>
-      </w:r>
-    </w:p>
-    <w:p>
-      <w:pPr>
-        <w:pStyle w:val="ListParagraph"/>
-        <w:numPr>
-          <w:ilvl w:val="0"/>
-          <w:numId w:val="6"/>
-        </w:numPr>
-        <w:autoSpaceDE w:val="0"/>
-        <w:autoSpaceDN w:val="0"/>
-        <w:ind w:left="360" w:right="-120"/>
-        <w:jc w:val="both"/>
-        <w:rPr>
-          <w:rFonts w:ascii="Garamond" w:hAnsi="Garamond" w:cs="Big Caslon Medium"/>
-          <w:sz w:val="23"/>
-          <w:szCs w:val="23"/>
-        </w:rPr>
-      </w:pPr>
-      <w:r>
-        <w:rPr>
-          <w:rFonts w:ascii="Garamond" w:hAnsi="Garamond" w:cs="Big Caslon Medium"/>
-          <w:sz w:val="23"/>
-          <w:szCs w:val="23"/>
-        </w:rPr>
-        <w:t xml:space="preserve">Communications Security </w:t>
-      </w:r>
-      <w:r>
-        <w:rPr>
-          <w:rFonts w:ascii="Garamond" w:hAnsi="Garamond" w:cs="Big Caslon Medium"/>
-          <w:sz w:val="23"/>
-          <w:szCs w:val="23"/>
-        </w:rPr>
-        <w:t xml:space="preserve"> </w:t>
-      </w:r>
-    </w:p>
-    <w:p>
-      <w:pPr>
-        <w:pStyle w:val="ListParagraph"/>
-        <w:autoSpaceDE w:val="0"/>
-        <w:autoSpaceDN w:val="0"/>
-        <w:jc w:val="both"/>
-        <w:rPr>
-          <w:rFonts w:ascii="Garamond" w:hAnsi="Garamond" w:cs="Big Caslon Medium"/>
-          <w:sz w:val="23"/>
-          <w:szCs w:val="23"/>
-        </w:rPr>
-      </w:pPr>
-    </w:p>
-    <w:p>
-      <w:pPr>
-        <w:pStyle w:val="ListParagraph"/>
-        <w:numPr>
-          <w:ilvl w:val="0"/>
-          <w:numId w:val="6"/>
-        </w:numPr>
-        <w:autoSpaceDE w:val="0"/>
-        <w:autoSpaceDN w:val="0"/>
-        <w:ind w:left="180"/>
-        <w:jc w:val="both"/>
-        <w:rPr>
-          <w:rFonts w:ascii="Garamond" w:hAnsi="Garamond" w:cs="Big Caslon Medium"/>
-          <w:sz w:val="23"/>
-          <w:szCs w:val="23"/>
-        </w:rPr>
-      </w:pPr>
-      <w:r>
-        <w:rPr>
-          <w:rFonts w:ascii="Garamond" w:hAnsi="Garamond" w:cs="Big Caslon Medium"/>
-          <w:sz w:val="23"/>
-          <w:szCs w:val="23"/>
-        </w:rPr>
-        <w:t>Access | Identity Manageme</w:t>
-      </w:r>
-      <w:r>
-        <w:rPr>
-          <w:rFonts w:ascii="Garamond" w:hAnsi="Garamond" w:cs="Big Caslon Medium"/>
-          <w:sz w:val="23"/>
-          <w:szCs w:val="23"/>
-        </w:rPr>
-        <w:t>n</w:t>
-      </w:r>
-      <w:r>
-        <w:rPr>
-          <w:rFonts w:ascii="Garamond" w:hAnsi="Garamond" w:cs="Big Caslon Medium"/>
-          <w:sz w:val="23"/>
-          <w:szCs w:val="23"/>
-        </w:rPr>
-        <w:t>t</w:t>
-      </w:r>
-    </w:p>
-    <w:p>
-      <w:pPr>
-        <w:pStyle w:val="ListParagraph"/>
-        <w:numPr>
-          <w:ilvl w:val="0"/>
-          <w:numId w:val="6"/>
-        </w:numPr>
-        <w:autoSpaceDE w:val="0"/>
-        <w:autoSpaceDN w:val="0"/>
-        <w:ind w:left="180"/>
-        <w:jc w:val="both"/>
-        <w:rPr>
-          <w:rFonts w:ascii="Garamond" w:hAnsi="Garamond" w:cs="Big Caslon Medium"/>
-          <w:sz w:val="23"/>
-          <w:szCs w:val="23"/>
-        </w:rPr>
-      </w:pPr>
-      <w:r>
-        <w:rPr>
-          <w:rFonts w:ascii="Garamond" w:hAnsi="Garamond" w:cs="Big Caslon Medium"/>
-          <w:sz w:val="23"/>
-          <w:szCs w:val="23"/>
-        </w:rPr>
-        <w:t>Network Security</w:t>
-      </w:r>
-      <w:r>
-        <w:rPr>
-          <w:rFonts w:ascii="Garamond" w:hAnsi="Garamond" w:cs="Big Caslon Medium"/>
-          <w:sz w:val="23"/>
-          <w:szCs w:val="23"/>
-        </w:rPr>
-        <w:t xml:space="preserve"> </w:t>
-      </w:r>
-    </w:p>
-    <w:p>
-      <w:pPr>
-        <w:pStyle w:val="ListParagraph"/>
-        <w:numPr>
-          <w:ilvl w:val="0"/>
-          <w:numId w:val="6"/>
-        </w:numPr>
-        <w:autoSpaceDE w:val="0"/>
-        <w:autoSpaceDN w:val="0"/>
-        <w:ind w:left="180"/>
-        <w:jc w:val="both"/>
-        <w:rPr>
-          <w:rFonts w:ascii="Garamond" w:hAnsi="Garamond" w:cs="Big Caslon Medium"/>
-          <w:sz w:val="23"/>
-          <w:szCs w:val="23"/>
-        </w:rPr>
-      </w:pPr>
-      <w:r>
-        <w:rPr>
-          <w:rFonts w:ascii="Garamond" w:hAnsi="Garamond" w:cs="Big Caslon Medium"/>
-          <w:sz w:val="23"/>
-          <w:szCs w:val="23"/>
-        </w:rPr>
-        <w:t>Design | Architecture</w:t>
-      </w:r>
-      <w:r>
-        <w:rPr>
-          <w:rFonts w:ascii="Garamond" w:hAnsi="Garamond" w:cs="Big Caslon Medium"/>
-          <w:sz w:val="23"/>
-          <w:szCs w:val="23"/>
-        </w:rPr>
-        <w:t xml:space="preserve"> </w:t>
-      </w:r>
-    </w:p>
-    <w:p>
-      <w:pPr>
-        <w:autoSpaceDE w:val="0"/>
-        <w:autoSpaceDN w:val="0"/>
-        <w:jc w:val="both"/>
-        <w:rPr>
-          <w:rFonts w:ascii="Garamond" w:hAnsi="Garamond" w:cs="Big Caslon Medium"/>
-          <w:sz w:val="23"/>
-          <w:szCs w:val="23"/>
-        </w:rPr>
-        <w:sectPr>
-          <w:type w:val="continuous"/>
-          <w:pgSz w:w="12240" w:h="15840"/>
-          <w:pgMar w:top="720" w:right="720" w:bottom="288" w:left="720" w:header="720" w:footer="720" w:gutter="0"/>
-          <w:cols w:num="3" w:space="720"/>
           <w:docGrid w:linePitch="360"/>
         </w:sectPr>
       </w:pPr>
@@ -1751,243 +1388,50 @@
         <w:t>TECHNICAL COMPETENCIES</w:t>
       </w:r>
     </w:p>
-    <w:p>
-      <w:pPr>
-        <w:shd w:val="clear" w:color="auto" w:fill="FFFFFF"/>
-        <w:contextualSpacing/>
-        <w:jc w:val="center"/>
-        <w:rPr>
-          <w:rFonts w:ascii="Garamond" w:hAnsi="Garamond"/>
-          <w:b/>
-          <w:sz w:val="23"/>
-          <w:szCs w:val="23"/>
-        </w:rPr>
-        <w:sectPr>
-          <w:type w:val="continuous"/>
-          <w:pgSz w:w="12240" w:h="15840"/>
-          <w:pgMar w:top="720" w:right="720" w:bottom="288" w:left="720" w:header="720" w:footer="720" w:gutter="0"/>
-          <w:cols w:space="720"/>
-          <w:titlePg/>
-          <w:docGrid w:linePitch="360"/>
-        </w:sectPr>
-      </w:pPr>
-    </w:p>
-    <w:p>
-      <w:pPr>
-        <w:rPr>
-          <w:rFonts w:ascii="Garamond" w:hAnsi="Garamond"/>
-          <w:b/>
-          <w:sz w:val="23"/>
-          <w:szCs w:val="23"/>
-        </w:rPr>
-      </w:pPr>
-    </w:p>
-    <w:p>
-      <w:pPr>
-        <w:rPr>
-          <w:rFonts w:ascii="Garamond" w:hAnsi="Garamond"/>
-          <w:sz w:val="23"/>
-          <w:szCs w:val="23"/>
-        </w:rPr>
-      </w:pPr>
-      <w:r>
-        <w:rPr>
-          <w:rFonts w:ascii="Garamond" w:hAnsi="Garamond"/>
-          <w:b/>
-          <w:sz w:val="23"/>
-          <w:szCs w:val="23"/>
-        </w:rPr>
-        <w:t>Programming: C++, Python, Java, HTML, CSS, JavaScript, TypeScript, PHP, Bash, Regex</w:t>
-      </w:r>
-      <w:r>
-        <w:rPr>
-          <w:rFonts w:ascii="Garamond" w:hAnsi="Garamond"/>
-          <w:sz w:val="23"/>
-          <w:szCs w:val="23"/>
-        </w:rPr>
-      </w:r>
-      <w:r>
-        <w:rPr>
-          <w:rFonts w:ascii="Garamond" w:hAnsi="Garamond"/>
-          <w:sz w:val="23"/>
-          <w:szCs w:val="23"/>
-        </w:rPr>
-      </w:r>
-      <w:r>
-        <w:rPr>
-          <w:rFonts w:ascii="Garamond" w:hAnsi="Garamond"/>
-          <w:sz w:val="23"/>
-          <w:szCs w:val="23"/>
-        </w:rPr>
-      </w:r>
-      <w:r>
-        <w:rPr>
-          <w:rFonts w:ascii="Garamond" w:hAnsi="Garamond"/>
-          <w:sz w:val="23"/>
-          <w:szCs w:val="23"/>
-        </w:rPr>
-      </w:r>
-    </w:p>
-    <w:p>
-      <w:pPr>
-        <w:shd w:val="clear" w:color="auto" w:fill="FFFFFF"/>
-        <w:contextualSpacing/>
-        <w:rPr>
-          <w:rFonts w:ascii="Garamond" w:hAnsi="Garamond"/>
-          <w:sz w:val="23"/>
-          <w:szCs w:val="23"/>
-        </w:rPr>
-      </w:pPr>
-      <w:r>
-        <w:rPr>
-          <w:rFonts w:ascii="Garamond" w:hAnsi="Garamond"/>
-          <w:b/>
-          <w:sz w:val="23"/>
-          <w:szCs w:val="23"/>
-        </w:rPr>
-        <w:t>Operating Systems: Linux, Unix, macOS, Windows 10/11</w:t>
-      </w:r>
-      <w:r>
-        <w:rPr>
-          <w:rFonts w:ascii="Garamond" w:hAnsi="Garamond"/>
-          <w:sz w:val="23"/>
-          <w:szCs w:val="23"/>
-        </w:rPr>
-      </w:r>
-      <w:r>
-        <w:rPr>
-          <w:rFonts w:ascii="Garamond" w:hAnsi="Garamond"/>
-          <w:b/>
-          <w:sz w:val="23"/>
-          <w:szCs w:val="23"/>
-        </w:rPr>
-      </w:r>
-      <w:r>
-        <w:rPr>
-          <w:rFonts w:ascii="Garamond" w:hAnsi="Garamond"/>
-          <w:sz w:val="23"/>
-          <w:szCs w:val="23"/>
-        </w:rPr>
-      </w:r>
-      <w:r>
-        <w:rPr>
-          <w:rFonts w:ascii="Garamond" w:hAnsi="Garamond"/>
-          <w:sz w:val="23"/>
-          <w:szCs w:val="23"/>
-        </w:rPr>
-      </w:r>
-      <w:r>
-        <w:rPr>
-          <w:rFonts w:ascii="Garamond" w:hAnsi="Garamond"/>
-          <w:sz w:val="23"/>
-          <w:szCs w:val="23"/>
-        </w:rPr>
-      </w:r>
-      <w:r>
-        <w:rPr>
-          <w:rFonts w:ascii="Garamond" w:hAnsi="Garamond"/>
-          <w:sz w:val="23"/>
-          <w:szCs w:val="23"/>
-        </w:rPr>
-      </w:r>
-    </w:p>
-    <w:p>
-      <w:pPr>
-        <w:shd w:val="clear" w:color="auto" w:fill="FFFFFF"/>
-        <w:contextualSpacing/>
-        <w:rPr>
-          <w:rFonts w:ascii="Garamond" w:hAnsi="Garamond"/>
-          <w:sz w:val="23"/>
-          <w:szCs w:val="23"/>
-        </w:rPr>
-      </w:pPr>
-      <w:r>
-        <w:rPr>
-          <w:rFonts w:ascii="Garamond" w:hAnsi="Garamond"/>
-          <w:b/>
-          <w:sz w:val="23"/>
-          <w:szCs w:val="23"/>
-        </w:rPr>
-        <w:t>Software | Tools: Git, Docker, Docker Compose, MySQL, Apache, Bootstrap, Grafana, Splunk, Observe, Jira, Jira Service Management (JSM), Confluence, Slack, Microsoft Teams, AWS Systems Manager (SSM), Kiro (AI), Office 365, SharePoint, course authoring tools</w:t>
-      </w:r>
-      <w:r>
-        <w:rPr>
-          <w:rFonts w:ascii="Garamond" w:hAnsi="Garamond"/>
-          <w:b/>
-          <w:sz w:val="23"/>
-          <w:szCs w:val="23"/>
-        </w:rPr>
-      </w:r>
-      <w:r>
-        <w:rPr>
-          <w:rFonts w:ascii="Garamond" w:hAnsi="Garamond"/>
-          <w:sz w:val="23"/>
-          <w:szCs w:val="23"/>
-        </w:rPr>
-      </w:r>
-      <w:r>
-        <w:rPr>
-          <w:rFonts w:ascii="Garamond" w:hAnsi="Garamond"/>
-          <w:sz w:val="23"/>
-          <w:szCs w:val="23"/>
-        </w:rPr>
-      </w:r>
-      <w:r>
-        <w:rPr>
-          <w:rFonts w:ascii="Garamond" w:hAnsi="Garamond"/>
-          <w:sz w:val="23"/>
-          <w:szCs w:val="23"/>
-        </w:rPr>
-      </w:r>
-      <w:r>
-        <w:rPr>
-          <w:rFonts w:ascii="Garamond" w:hAnsi="Garamond"/>
-          <w:sz w:val="23"/>
-          <w:szCs w:val="23"/>
-        </w:rPr>
-      </w:r>
-      <w:r>
-        <w:rPr>
-          <w:rFonts w:ascii="Garamond" w:hAnsi="Garamond"/>
-          <w:sz w:val="23"/>
-          <w:szCs w:val="23"/>
-        </w:rPr>
-      </w:r>
-      <w:r>
-        <w:rPr>
-          <w:rFonts w:ascii="Garamond" w:hAnsi="Garamond"/>
-          <w:sz w:val="23"/>
-          <w:szCs w:val="23"/>
-        </w:rPr>
-      </w:r>
-      <w:r>
-        <w:rPr>
-          <w:rFonts w:ascii="Garamond" w:hAnsi="Garamond"/>
-          <w:sz w:val="23"/>
-          <w:szCs w:val="23"/>
-        </w:rPr>
-      </w:r>
-      <w:r>
-        <w:rPr>
-          <w:rFonts w:ascii="Garamond" w:hAnsi="Garamond"/>
-          <w:sz w:val="23"/>
-          <w:szCs w:val="23"/>
-        </w:rPr>
-      </w:r>
-    </w:p>
-    <w:p>
-      <w:pPr>
-        <w:shd w:val="clear" w:color="auto" w:fill="FFFFFF"/>
-        <w:contextualSpacing/>
-        <w:jc w:val="center"/>
-        <w:rPr>
-          <w:rFonts w:ascii="Garamond" w:hAnsi="Garamond"/>
-          <w:b/>
-          <w:sz w:val="23"/>
-          <w:szCs w:val="23"/>
-        </w:rPr>
-      </w:pPr>
-    </w:p>
+    <w:p/>
+    <w:p>
+      <w:pPr/>
+      <w:r>
+        <w:t>Programming: Python, JavaScript, TypeScript, HTML, CSS, Java, C++, PHP, Bash, Regex</w:t>
+      </w:r>
+    </w:p>
+    <w:p>
+      <w:pPr/>
+      <w:r>
+        <w:t>Streaming &amp; Incident Response: Live Streaming, VOD, Incident Management, Log Analysis, Observability</w:t>
+      </w:r>
+    </w:p>
+    <w:p>
+      <w:pPr/>
+      <w:r>
+        <w:t>Operating Systems: Linux, Unix, macOS, Windows 10/11, AWS Systems Manager (SSM)</w:t>
+      </w:r>
+    </w:p>
+    <w:p>
+      <w:pPr/>
+      <w:r>
+        <w:t>Observability &amp; Collaboration: Grafana, Splunk, Observe, Jira, Jira Service Management (JSM), Confluence, Slack, Microsoft Teams</w:t>
+      </w:r>
+    </w:p>
+    <w:p>
+      <w:pPr/>
+      <w:r>
+        <w:t>Software &amp; Tools: Git, Docker, Docker Compose, MySQL, Apache, Bootstrap, Kiro, Office 365, SharePoint, course authoring tools</w:t>
+      </w:r>
+    </w:p>
+    <w:p>
+      <w:pPr/>
+      <w:r>
+        <w:t>Security: Information Assurance, Network Security, Access Management, Risk Management</w:t>
+      </w:r>
+    </w:p>
+    <w:p>
+      <w:pPr/>
+      <w:r>
+        <w:t>Methods: Agile</w:t>
+      </w:r>
+    </w:p>
+    <w:p/>
     <w:p>
       <w:pPr>
         <w:pBdr>
@@ -2070,7 +1514,7 @@
         <w:pStyle w:val="ListParagraph"/>
       </w:pPr>
       <w:r>
-        <w:t>Provide technical support for a cloud-based live and VOD streaming platform, troubleshooting playback, ingest, and delivery issues through to root cause</w:t>
+        <w:t>Support 25+ streaming customers, including 3 VIP accounts, with weekly/bi-weekly syncs for one VIP customer</w:t>
       </w:r>
     </w:p>
     <w:p>
@@ -2078,16 +1522,15 @@
         <w:pStyle w:val="ListParagraph"/>
       </w:pPr>
       <w:r>
-        <w:t>Led triage and customer communications for 25+ high-priority incidents, partnering with developers to diagnose issues and keep stakeholders informed</w:t>
-      </w:r>
-    </w:p>
-    <w:p/>
+        <w:t>Built web-based and Android video players used for live and VOD troubleshooting across ingest, packaging, playback, and delivery</w:t>
+      </w:r>
+    </w:p>
     <w:p>
       <w:pPr>
         <w:pStyle w:val="ListParagraph"/>
       </w:pPr>
       <w:r>
-        <w:t>Author and proofread Official Incident Reports (OIRs) and Root Cause Analyses (RCAs) for major incidents</w:t>
+        <w:t>Triage and communicate status for 25+ high-priority incidents; escalate with development for code-level diagnosis and fix validation</w:t>
       </w:r>
     </w:p>
     <w:p>
@@ -2095,7 +1538,7 @@
         <w:pStyle w:val="ListParagraph"/>
       </w:pPr>
       <w:r>
-        <w:t>Created and presented 10+ Technical Knowledge Shares (TKS) to improve team troubleshooting and operational readiness</w:t>
+        <w:t>Maintain Git-based customer configuration for 4+ accounts and keep API-driven Python troubleshooting scripts current</w:t>
       </w:r>
     </w:p>
     <w:p>
@@ -2103,7 +1546,7 @@
         <w:pStyle w:val="ListParagraph"/>
       </w:pPr>
       <w:r>
-        <w:t>Use observability and monitoring tools including Grafana, Splunk, Observe, and Jira Service Management (JSM) to investigate incidents and system health</w:t>
+        <w:t>Cut mean time to mitigation (MTTM) and mean time to repair (MTTR) by more than 5%, and reduced average response time by at least 5 minutes</w:t>
       </w:r>
     </w:p>
     <w:p>
@@ -2111,7 +1554,7 @@
         <w:pStyle w:val="ListParagraph"/>
       </w:pPr>
       <w:r>
-        <w:t>Automate and accelerate troubleshooting with Python scripting, regular expressions, and AI-assisted analysis in Kiro</w:t>
+        <w:t>Write and edit Official Incident Reports (OIRs) and Root Cause Analysis (RCA) documents for major service incidents</w:t>
       </w:r>
     </w:p>
     <w:p>
@@ -2119,7 +1562,7 @@
         <w:pStyle w:val="ListParagraph"/>
       </w:pPr>
       <w:r>
-        <w:t>Access and administer production systems via macOS/Unix environments and AWS Systems Manager (SSM) remote login</w:t>
+        <w:t>Query and correlate telemetry in Grafana, Splunk, Observe, and Jira Service Management (JSM) during active incidents</w:t>
       </w:r>
     </w:p>
     <w:p>
@@ -2127,10 +1570,9 @@
         <w:pStyle w:val="ListParagraph"/>
       </w:pPr>
       <w:r>
-        <w:t>Coordinate incident response and knowledge sharing across Slack, Microsoft Teams, Jira, and Confluence</w:t>
-      </w:r>
-    </w:p>
-    <w:p/>
+        <w:t>Access production systems with AWS Systems Manager (SSM) Session Manager from macOS and Unix shells; present 10+ Technical Knowledge Shares (TKS)</w:t>
+      </w:r>
+    </w:p>
     <w:p>
       <w:pPr/>
       <w:r>
@@ -2187,7 +1629,7 @@
         <w:pStyle w:val="ListParagraph"/>
       </w:pPr>
       <w:r>
-        <w:t>Supported Joint Knowledge Online (JKO) learning content as a Programmer Analyst, troubleshooting course defects and delivery issues</w:t>
+        <w:t>Debug and repair Joint Knowledge Online (JKO) e-learning courses, including content defects and course-player failures</w:t>
       </w:r>
     </w:p>
     <w:p>
@@ -2195,7 +1637,7 @@
         <w:pStyle w:val="ListParagraph"/>
       </w:pPr>
       <w:r>
-        <w:t>Updated and maintained interactive training courses using HTML, CSS, JavaScript, TypeScript, and course authoring software</w:t>
+        <w:t>Maintain interactive courseware with HTML, CSS, JavaScript, TypeScript, and course authoring tools</w:t>
       </w:r>
     </w:p>
     <w:p>
@@ -2203,7 +1645,7 @@
         <w:pStyle w:val="ListParagraph"/>
       </w:pPr>
       <w:r>
-        <w:t>Reviewed courses for functionality, content quality, and technical readiness prior to release</w:t>
+        <w:t>Test courses for functional defects, browser/player compatibility, and release readiness before publish</w:t>
       </w:r>
     </w:p>
     <w:p>
@@ -2211,7 +1653,7 @@
         <w:pStyle w:val="ListParagraph"/>
       </w:pPr>
       <w:r>
-        <w:t>Diagnosed front-end and course-player issues to improve learner experience on the JKO platform</w:t>
+        <w:t>Trace front-end errors in course packages and player behavior; document findings for content and engineering updates</w:t>
       </w:r>
     </w:p>
     <w:p>
@@ -2301,7 +1743,7 @@
         <w:pStyle w:val="ListParagraph"/>
       </w:pPr>
       <w:r>
-        <w:t>Utilized schematics, technical drawings, and applied logical knowledge in the repair of ten types of air pressure scanners</w:t>
+        <w:t>Used schematics, technical drawings, and applied logical knowledge in the repair of ten types of air pressure scanners</w:t>
       </w:r>
     </w:p>
     <w:p>
@@ -2498,7 +1940,7 @@
         <w:pStyle w:val="ListParagraph"/>
       </w:pPr>
       <w:r>
-        <w:t>Utilized schematic references to troubleshoot electronic, pneumatic, and mechanical failures</w:t>
+        <w:t>Used schematic references to troubleshoot electronic, pneumatic, and mechanical failures</w:t>
       </w:r>
     </w:p>
     <w:p>

</xml_diff>